<commit_message>
feat: adicionar novos modelos e guias de elaboração dos requisitos
</commit_message>
<xml_diff>
--- a/public/documents/requirement4/4_3/4_3_modelo_ambito.docx
+++ b/public/documents/requirement4/4_3/4_3_modelo_ambito.docx
@@ -4,6 +4,7 @@
   <w:body>
     <w:p>
       <w:pPr>
+        <w:spacing w:before="240" w:line="240" w:lineRule="auto"/>
         <w:jc w:val="center"/>
         <w:rPr>
           <w:rFonts w:ascii="Cambria" w:hAnsi="Cambria"/>
@@ -716,21 +717,13 @@
     <w:pPr>
       <w:pStyle w:val="Cabealho"/>
       <w:jc w:val="center"/>
-      <w:rPr>
-        <w:rFonts w:ascii="Cambria" w:hAnsi="Cambria"/>
-      </w:rPr>
     </w:pPr>
     <w:r>
       <w:rPr>
         <w:rFonts w:ascii="Cambria" w:hAnsi="Cambria"/>
       </w:rPr>
-      <w:t>NOME DA ORGANIZAÇÃO</w:t>
+      <w:t>INTEGRA – INTEGRAÇÃO DE SISTEMAS DE GESTÃO</w:t>
     </w:r>
-  </w:p>
-  <w:p>
-    <w:pPr>
-      <w:pStyle w:val="Cabealho"/>
-    </w:pPr>
   </w:p>
 </w:hdr>
 </file>

</xml_diff>

<commit_message>
refactor: padronizar estrutura dos requisitos e atualizar documentação
</commit_message>
<xml_diff>
--- a/public/documents/requirement4/4_3/4_3_modelo_ambito.docx
+++ b/public/documents/requirement4/4_3/4_3_modelo_ambito.docx
@@ -1,11 +1,1281 @@
 
 <file path=word/document.xml><?xml version="1.0" encoding="utf-8"?>
-<w:document xmlns:wpc="http://schemas.microsoft.com/office/word/2010/wordprocessingCanvas" xmlns:cx="http://schemas.microsoft.com/office/drawing/2014/chartex" xmlns:cx1="http://schemas.microsoft.com/office/drawing/2015/9/8/chartex" xmlns:cx2="http://schemas.microsoft.com/office/drawing/2015/10/21/chartex" xmlns:cx3="http://schemas.microsoft.com/office/drawing/2016/5/9/chartex" xmlns:cx4="http://schemas.microsoft.com/office/drawing/2016/5/10/chartex" xmlns:cx5="http://schemas.microsoft.com/office/drawing/2016/5/11/chartex" xmlns:cx6="http://schemas.microsoft.com/office/drawing/2016/5/12/chartex" xmlns:cx7="http://schemas.microsoft.com/office/drawing/2016/5/13/chartex" xmlns:cx8="http://schemas.microsoft.com/office/drawing/2016/5/14/chartex" xmlns:mc="http://schemas.openxmlformats.org/markup-compatibility/2006" xmlns:aink="http://schemas.microsoft.com/office/drawing/2016/ink" xmlns:am3d="http://schemas.microsoft.com/office/drawing/2017/model3d" xmlns:o="urn:schemas-microsoft-com:office:office" xmlns:oel="http://schemas.microsoft.com/office/2019/extlst" xmlns:r="http://schemas.openxmlformats.org/officeDocument/2006/relationships" xmlns:m="http://schemas.openxmlformats.org/officeDocument/2006/math" xmlns:v="urn:schemas-microsoft-com:vml" xmlns:wp14="http://schemas.microsoft.com/office/word/2010/wordprocessingDrawing" xmlns:wp="http://schemas.openxmlformats.org/drawingml/2006/wordprocessingDrawing" xmlns:w10="urn:schemas-microsoft-com:office:word" xmlns:w="http://schemas.openxmlformats.org/wordprocessingml/2006/main" xmlns:w14="http://schemas.microsoft.com/office/word/2010/wordml" xmlns:w15="http://schemas.microsoft.com/office/word/2012/wordml" xmlns:w16cex="http://schemas.microsoft.com/office/word/2018/wordml/cex" xmlns:w16cid="http://schemas.microsoft.com/office/word/2016/wordml/cid" xmlns:w16="http://schemas.microsoft.com/office/word/2018/wordml" xmlns:w16du="http://schemas.microsoft.com/office/word/2023/wordml/word16du" xmlns:w16sdtdh="http://schemas.microsoft.com/office/word/2020/wordml/sdtdatahash" xmlns:w16sdtfl="http://schemas.microsoft.com/office/word/2024/wordml/sdtformatlock" xmlns:w16se="http://schemas.microsoft.com/office/word/2015/wordml/symex" xmlns:wpg="http://schemas.microsoft.com/office/word/2010/wordprocessingGroup" xmlns:wpi="http://schemas.microsoft.com/office/word/2010/wordprocessingInk" xmlns:wne="http://schemas.microsoft.com/office/word/2006/wordml" xmlns:wps="http://schemas.microsoft.com/office/word/2010/wordprocessingShape" mc:Ignorable="w14 w15 w16se w16cid w16 w16cex w16sdtdh w16sdtfl w16du wp14">
+<w:document xmlns:wpc="http://schemas.microsoft.com/office/word/2010/wordprocessingCanvas" xmlns:cx="http://schemas.microsoft.com/office/drawing/2014/chartex" xmlns:cx1="http://schemas.microsoft.com/office/drawing/2015/9/8/chartex" xmlns:cx2="http://schemas.microsoft.com/office/drawing/2015/10/21/chartex" xmlns:cx3="http://schemas.microsoft.com/office/drawing/2016/5/9/chartex" xmlns:cx4="http://schemas.microsoft.com/office/drawing/2016/5/10/chartex" xmlns:cx5="http://schemas.microsoft.com/office/drawing/2016/5/11/chartex" xmlns:cx6="http://schemas.microsoft.com/office/drawing/2016/5/12/chartex" xmlns:cx7="http://schemas.microsoft.com/office/drawing/2016/5/13/chartex" xmlns:cx8="http://schemas.microsoft.com/office/drawing/2016/5/14/chartex" xmlns:mc="http://schemas.openxmlformats.org/markup-compatibility/2006" xmlns:aink="http://schemas.microsoft.com/office/drawing/2016/ink" xmlns:am3d="http://schemas.microsoft.com/office/drawing/2017/model3d" xmlns:o="urn:schemas-microsoft-com:office:office" xmlns:oel="http://schemas.microsoft.com/office/2019/extlst" xmlns:r="http://schemas.openxmlformats.org/officeDocument/2006/relationships" xmlns:m="http://schemas.openxmlformats.org/officeDocument/2006/math" xmlns:v="urn:schemas-microsoft-com:vml" xmlns:wp14="http://schemas.microsoft.com/office/word/2010/wordprocessingDrawing" xmlns:wp="http://schemas.openxmlformats.org/drawingml/2006/wordprocessingDrawing" xmlns:w10="urn:schemas-microsoft-com:office:word" xmlns:w="http://schemas.openxmlformats.org/wordprocessingml/2006/main" xmlns:w14="http://schemas.microsoft.com/office/word/2010/wordml" xmlns:w15="http://schemas.microsoft.com/office/word/2012/wordml" xmlns:w16cei="http://schemas.microsoft.com/office/word/2026/wordml/cei" xmlns:w16cex="http://schemas.microsoft.com/office/word/2018/wordml/cex" xmlns:w16cid="http://schemas.microsoft.com/office/word/2016/wordml/cid" xmlns:w16="http://schemas.microsoft.com/office/word/2018/wordml" xmlns:w16du="http://schemas.microsoft.com/office/word/2023/wordml/word16du" xmlns:w16sdtdh="http://schemas.microsoft.com/office/word/2020/wordml/sdtdatahash" xmlns:w16sdtfl="http://schemas.microsoft.com/office/word/2024/wordml/sdtformatlock" xmlns:w16se="http://schemas.microsoft.com/office/word/2015/wordml/symex" xmlns:wpg="http://schemas.microsoft.com/office/word/2010/wordprocessingGroup" xmlns:wpi="http://schemas.microsoft.com/office/word/2010/wordprocessingInk" xmlns:wne="http://schemas.microsoft.com/office/word/2006/wordml" xmlns:wps="http://schemas.microsoft.com/office/word/2010/wordprocessingShape" mc:Ignorable="w14 w15 w16se w16cid w16 w16cex w16sdtdh w16sdtfl w16du wp14">
   <w:body>
     <w:p>
       <w:pPr>
-        <w:spacing w:before="240" w:line="240" w:lineRule="auto"/>
-        <w:jc w:val="center"/>
+        <w:rPr>
+          <w:rFonts w:ascii="Cambria" w:hAnsi="Cambria"/>
+        </w:rPr>
+      </w:pPr>
+    </w:p>
+    <w:p>
+      <w:pPr>
+        <w:rPr>
+          <w:rFonts w:ascii="Cambria" w:hAnsi="Cambria"/>
+          <w:b/>
+          <w:bCs/>
+        </w:rPr>
+      </w:pPr>
+      <w:r>
+        <w:rPr>
+          <w:rFonts w:ascii="Cambria" w:hAnsi="Cambria"/>
+          <w:b/>
+          <w:bCs/>
+        </w:rPr>
+        <w:t>COMO DEFINIR O ÂMBITO DO SISTEMA DE GESTÃO?</w:t>
+      </w:r>
+    </w:p>
+    <w:p>
+      <w:pPr>
+        <w:rPr>
+          <w:rFonts w:ascii="Cambria" w:hAnsi="Cambria"/>
+        </w:rPr>
+      </w:pPr>
+      <w:r>
+        <w:rPr>
+          <w:rFonts w:ascii="Cambria" w:hAnsi="Cambria"/>
+        </w:rPr>
+        <w:t>O âmbito descreve quais atividades, produtos, serviços, processos e locais serão abrangidos pelo Sistema de Gestão. Deve representar a realidade da organização e refletir aquilo que efetivamente será gerido pelo sistema.</w:t>
+      </w:r>
+    </w:p>
+    <w:p>
+      <w:pPr>
+        <w:rPr>
+          <w:rFonts w:ascii="Cambria" w:hAnsi="Cambria"/>
+        </w:rPr>
+      </w:pPr>
+    </w:p>
+    <w:tbl>
+      <w:tblPr>
+        <w:tblW w:w="0" w:type="auto"/>
+        <w:tblCellSpacing w:w="15" w:type="dxa"/>
+        <w:tblBorders>
+          <w:top w:val="single" w:sz="4" w:space="0" w:color="auto"/>
+          <w:left w:val="single" w:sz="4" w:space="0" w:color="auto"/>
+          <w:bottom w:val="single" w:sz="4" w:space="0" w:color="auto"/>
+          <w:right w:val="single" w:sz="4" w:space="0" w:color="auto"/>
+          <w:insideH w:val="single" w:sz="4" w:space="0" w:color="auto"/>
+          <w:insideV w:val="single" w:sz="4" w:space="0" w:color="auto"/>
+        </w:tblBorders>
+        <w:tblCellMar>
+          <w:top w:w="15" w:type="dxa"/>
+          <w:left w:w="15" w:type="dxa"/>
+          <w:bottom w:w="15" w:type="dxa"/>
+          <w:right w:w="15" w:type="dxa"/>
+        </w:tblCellMar>
+        <w:tblLook w:val="04A0" w:firstRow="1" w:lastRow="0" w:firstColumn="1" w:lastColumn="0" w:noHBand="0" w:noVBand="1"/>
+      </w:tblPr>
+      <w:tblGrid>
+        <w:gridCol w:w="1863"/>
+        <w:gridCol w:w="3498"/>
+        <w:gridCol w:w="3133"/>
+      </w:tblGrid>
+      <w:tr>
+        <w:trPr>
+          <w:tblHeader/>
+          <w:tblCellSpacing w:w="15" w:type="dxa"/>
+        </w:trPr>
+        <w:tc>
+          <w:tcPr>
+            <w:tcW w:w="0" w:type="auto"/>
+            <w:vAlign w:val="center"/>
+            <w:hideMark/>
+          </w:tcPr>
+          <w:p>
+            <w:pPr>
+              <w:rPr>
+                <w:rFonts w:ascii="Cambria" w:hAnsi="Cambria"/>
+              </w:rPr>
+            </w:pPr>
+            <w:r>
+              <w:rPr>
+                <w:rFonts w:ascii="Cambria" w:hAnsi="Cambria"/>
+              </w:rPr>
+              <w:t>Etapa</w:t>
+            </w:r>
+          </w:p>
+        </w:tc>
+        <w:tc>
+          <w:tcPr>
+            <w:tcW w:w="0" w:type="auto"/>
+            <w:vAlign w:val="center"/>
+            <w:hideMark/>
+          </w:tcPr>
+          <w:p>
+            <w:pPr>
+              <w:rPr>
+                <w:rFonts w:ascii="Cambria" w:hAnsi="Cambria"/>
+              </w:rPr>
+            </w:pPr>
+            <w:r>
+              <w:rPr>
+                <w:rFonts w:ascii="Cambria" w:hAnsi="Cambria"/>
+              </w:rPr>
+              <w:t>O que fazer</w:t>
+            </w:r>
+          </w:p>
+        </w:tc>
+        <w:tc>
+          <w:tcPr>
+            <w:tcW w:w="0" w:type="auto"/>
+            <w:vAlign w:val="center"/>
+            <w:hideMark/>
+          </w:tcPr>
+          <w:p>
+            <w:pPr>
+              <w:rPr>
+                <w:rFonts w:ascii="Cambria" w:hAnsi="Cambria"/>
+              </w:rPr>
+            </w:pPr>
+            <w:r>
+              <w:rPr>
+                <w:rFonts w:ascii="Cambria" w:hAnsi="Cambria"/>
+              </w:rPr>
+              <w:t>Perguntas orientadoras</w:t>
+            </w:r>
+          </w:p>
+        </w:tc>
+      </w:tr>
+      <w:tr>
+        <w:trPr>
+          <w:tblCellSpacing w:w="15" w:type="dxa"/>
+        </w:trPr>
+        <w:tc>
+          <w:tcPr>
+            <w:tcW w:w="0" w:type="auto"/>
+            <w:vAlign w:val="center"/>
+            <w:hideMark/>
+          </w:tcPr>
+          <w:p>
+            <w:pPr>
+              <w:rPr>
+                <w:rFonts w:ascii="Cambria" w:hAnsi="Cambria"/>
+              </w:rPr>
+            </w:pPr>
+            <w:r>
+              <w:rPr>
+                <w:rFonts w:ascii="Cambria" w:hAnsi="Cambria"/>
+              </w:rPr>
+              <w:t>1. Conhecer a organização</w:t>
+            </w:r>
+          </w:p>
+        </w:tc>
+        <w:tc>
+          <w:tcPr>
+            <w:tcW w:w="0" w:type="auto"/>
+            <w:vAlign w:val="center"/>
+            <w:hideMark/>
+          </w:tcPr>
+          <w:p>
+            <w:pPr>
+              <w:rPr>
+                <w:rFonts w:ascii="Cambria" w:hAnsi="Cambria"/>
+              </w:rPr>
+            </w:pPr>
+            <w:r>
+              <w:rPr>
+                <w:rFonts w:ascii="Cambria" w:hAnsi="Cambria"/>
+              </w:rPr>
+              <w:t>Compreenda quais são as principais atividades desenvolvidas pela organização.</w:t>
+            </w:r>
+          </w:p>
+        </w:tc>
+        <w:tc>
+          <w:tcPr>
+            <w:tcW w:w="0" w:type="auto"/>
+            <w:vAlign w:val="center"/>
+            <w:hideMark/>
+          </w:tcPr>
+          <w:p>
+            <w:pPr>
+              <w:rPr>
+                <w:rFonts w:ascii="Cambria" w:hAnsi="Cambria"/>
+              </w:rPr>
+            </w:pPr>
+            <w:r>
+              <w:rPr>
+                <w:rFonts w:ascii="Cambria" w:hAnsi="Cambria"/>
+              </w:rPr>
+              <w:t>O que a organização faz? Quais produtos ou serviços oferece?</w:t>
+            </w:r>
+          </w:p>
+        </w:tc>
+      </w:tr>
+      <w:tr>
+        <w:trPr>
+          <w:tblCellSpacing w:w="15" w:type="dxa"/>
+        </w:trPr>
+        <w:tc>
+          <w:tcPr>
+            <w:tcW w:w="0" w:type="auto"/>
+            <w:vAlign w:val="center"/>
+            <w:hideMark/>
+          </w:tcPr>
+          <w:p>
+            <w:pPr>
+              <w:rPr>
+                <w:rFonts w:ascii="Cambria" w:hAnsi="Cambria"/>
+              </w:rPr>
+            </w:pPr>
+            <w:r>
+              <w:rPr>
+                <w:rFonts w:ascii="Cambria" w:hAnsi="Cambria"/>
+              </w:rPr>
+              <w:t>2. Analisar o contexto</w:t>
+            </w:r>
+          </w:p>
+        </w:tc>
+        <w:tc>
+          <w:tcPr>
+            <w:tcW w:w="0" w:type="auto"/>
+            <w:vAlign w:val="center"/>
+            <w:hideMark/>
+          </w:tcPr>
+          <w:p>
+            <w:pPr>
+              <w:rPr>
+                <w:rFonts w:ascii="Cambria" w:hAnsi="Cambria"/>
+              </w:rPr>
+            </w:pPr>
+            <w:r>
+              <w:rPr>
+                <w:rFonts w:ascii="Cambria" w:hAnsi="Cambria"/>
+              </w:rPr>
+              <w:t>Considere os fatores internos e externos identificados no requisito 4.1.</w:t>
+            </w:r>
+          </w:p>
+        </w:tc>
+        <w:tc>
+          <w:tcPr>
+            <w:tcW w:w="0" w:type="auto"/>
+            <w:vAlign w:val="center"/>
+            <w:hideMark/>
+          </w:tcPr>
+          <w:p>
+            <w:pPr>
+              <w:rPr>
+                <w:rFonts w:ascii="Cambria" w:hAnsi="Cambria"/>
+              </w:rPr>
+            </w:pPr>
+            <w:r>
+              <w:rPr>
+                <w:rFonts w:ascii="Cambria" w:hAnsi="Cambria"/>
+              </w:rPr>
+              <w:t>Existem fatores que influenciam o Sistema de Gestão?</w:t>
+            </w:r>
+          </w:p>
+        </w:tc>
+      </w:tr>
+      <w:tr>
+        <w:trPr>
+          <w:tblCellSpacing w:w="15" w:type="dxa"/>
+        </w:trPr>
+        <w:tc>
+          <w:tcPr>
+            <w:tcW w:w="0" w:type="auto"/>
+            <w:vAlign w:val="center"/>
+            <w:hideMark/>
+          </w:tcPr>
+          <w:p>
+            <w:pPr>
+              <w:rPr>
+                <w:rFonts w:ascii="Cambria" w:hAnsi="Cambria"/>
+              </w:rPr>
+            </w:pPr>
+            <w:r>
+              <w:rPr>
+                <w:rFonts w:ascii="Cambria" w:hAnsi="Cambria"/>
+              </w:rPr>
+              <w:t>3. Considerar as partes interessadas</w:t>
+            </w:r>
+          </w:p>
+        </w:tc>
+        <w:tc>
+          <w:tcPr>
+            <w:tcW w:w="0" w:type="auto"/>
+            <w:vAlign w:val="center"/>
+            <w:hideMark/>
+          </w:tcPr>
+          <w:p>
+            <w:pPr>
+              <w:rPr>
+                <w:rFonts w:ascii="Cambria" w:hAnsi="Cambria"/>
+              </w:rPr>
+            </w:pPr>
+            <w:r>
+              <w:rPr>
+                <w:rFonts w:ascii="Cambria" w:hAnsi="Cambria"/>
+              </w:rPr>
+              <w:t>Analise as necessidades e expectativas identificadas no requisito 4.2.</w:t>
+            </w:r>
+          </w:p>
+        </w:tc>
+        <w:tc>
+          <w:tcPr>
+            <w:tcW w:w="0" w:type="auto"/>
+            <w:vAlign w:val="center"/>
+            <w:hideMark/>
+          </w:tcPr>
+          <w:p>
+            <w:pPr>
+              <w:rPr>
+                <w:rFonts w:ascii="Cambria" w:hAnsi="Cambria"/>
+              </w:rPr>
+            </w:pPr>
+            <w:r>
+              <w:rPr>
+                <w:rFonts w:ascii="Cambria" w:hAnsi="Cambria"/>
+              </w:rPr>
+              <w:t>Existem requisitos que devem ser considerados no âmbito?</w:t>
+            </w:r>
+          </w:p>
+        </w:tc>
+      </w:tr>
+      <w:tr>
+        <w:trPr>
+          <w:tblCellSpacing w:w="15" w:type="dxa"/>
+        </w:trPr>
+        <w:tc>
+          <w:tcPr>
+            <w:tcW w:w="0" w:type="auto"/>
+            <w:vAlign w:val="center"/>
+            <w:hideMark/>
+          </w:tcPr>
+          <w:p>
+            <w:pPr>
+              <w:rPr>
+                <w:rFonts w:ascii="Cambria" w:hAnsi="Cambria"/>
+              </w:rPr>
+            </w:pPr>
+            <w:r>
+              <w:rPr>
+                <w:rFonts w:ascii="Cambria" w:hAnsi="Cambria"/>
+              </w:rPr>
+              <w:t>4. Definir o que será abrangido</w:t>
+            </w:r>
+          </w:p>
+        </w:tc>
+        <w:tc>
+          <w:tcPr>
+            <w:tcW w:w="0" w:type="auto"/>
+            <w:vAlign w:val="center"/>
+            <w:hideMark/>
+          </w:tcPr>
+          <w:p>
+            <w:pPr>
+              <w:rPr>
+                <w:rFonts w:ascii="Cambria" w:hAnsi="Cambria"/>
+              </w:rPr>
+            </w:pPr>
+            <w:r>
+              <w:rPr>
+                <w:rFonts w:ascii="Cambria" w:hAnsi="Cambria"/>
+              </w:rPr>
+              <w:t>Indique quais processos, produtos, serviços, departamentos e unidades fazem parte do Sistema de Gestão.</w:t>
+            </w:r>
+          </w:p>
+        </w:tc>
+        <w:tc>
+          <w:tcPr>
+            <w:tcW w:w="0" w:type="auto"/>
+            <w:vAlign w:val="center"/>
+            <w:hideMark/>
+          </w:tcPr>
+          <w:p>
+            <w:pPr>
+              <w:rPr>
+                <w:rFonts w:ascii="Cambria" w:hAnsi="Cambria"/>
+              </w:rPr>
+            </w:pPr>
+            <w:r>
+              <w:rPr>
+                <w:rFonts w:ascii="Cambria" w:hAnsi="Cambria"/>
+              </w:rPr>
+              <w:t>O que será controlado pelo Sistema de Gestão?</w:t>
+            </w:r>
+          </w:p>
+        </w:tc>
+      </w:tr>
+      <w:tr>
+        <w:trPr>
+          <w:tblCellSpacing w:w="15" w:type="dxa"/>
+        </w:trPr>
+        <w:tc>
+          <w:tcPr>
+            <w:tcW w:w="0" w:type="auto"/>
+            <w:vAlign w:val="center"/>
+            <w:hideMark/>
+          </w:tcPr>
+          <w:p>
+            <w:pPr>
+              <w:rPr>
+                <w:rFonts w:ascii="Cambria" w:hAnsi="Cambria"/>
+              </w:rPr>
+            </w:pPr>
+            <w:r>
+              <w:rPr>
+                <w:rFonts w:ascii="Cambria" w:hAnsi="Cambria"/>
+              </w:rPr>
+              <w:t>5. Definir os locais</w:t>
+            </w:r>
+          </w:p>
+        </w:tc>
+        <w:tc>
+          <w:tcPr>
+            <w:tcW w:w="0" w:type="auto"/>
+            <w:vAlign w:val="center"/>
+            <w:hideMark/>
+          </w:tcPr>
+          <w:p>
+            <w:pPr>
+              <w:rPr>
+                <w:rFonts w:ascii="Cambria" w:hAnsi="Cambria"/>
+              </w:rPr>
+            </w:pPr>
+            <w:r>
+              <w:rPr>
+                <w:rFonts w:ascii="Cambria" w:hAnsi="Cambria"/>
+              </w:rPr>
+              <w:t>Identifique todas as instalações incluídas no âmbito.</w:t>
+            </w:r>
+          </w:p>
+        </w:tc>
+        <w:tc>
+          <w:tcPr>
+            <w:tcW w:w="0" w:type="auto"/>
+            <w:vAlign w:val="center"/>
+            <w:hideMark/>
+          </w:tcPr>
+          <w:p>
+            <w:pPr>
+              <w:rPr>
+                <w:rFonts w:ascii="Cambria" w:hAnsi="Cambria"/>
+              </w:rPr>
+            </w:pPr>
+            <w:r>
+              <w:rPr>
+                <w:rFonts w:ascii="Cambria" w:hAnsi="Cambria"/>
+              </w:rPr>
+              <w:t>O sistema abrange apenas uma unidade ou várias?</w:t>
+            </w:r>
+          </w:p>
+        </w:tc>
+      </w:tr>
+      <w:tr>
+        <w:trPr>
+          <w:tblCellSpacing w:w="15" w:type="dxa"/>
+        </w:trPr>
+        <w:tc>
+          <w:tcPr>
+            <w:tcW w:w="0" w:type="auto"/>
+            <w:vAlign w:val="center"/>
+            <w:hideMark/>
+          </w:tcPr>
+          <w:p>
+            <w:pPr>
+              <w:rPr>
+                <w:rFonts w:ascii="Cambria" w:hAnsi="Cambria"/>
+              </w:rPr>
+            </w:pPr>
+            <w:r>
+              <w:rPr>
+                <w:rFonts w:ascii="Cambria" w:hAnsi="Cambria"/>
+              </w:rPr>
+              <w:t>6. Verificar exclusões</w:t>
+            </w:r>
+          </w:p>
+        </w:tc>
+        <w:tc>
+          <w:tcPr>
+            <w:tcW w:w="0" w:type="auto"/>
+            <w:vAlign w:val="center"/>
+            <w:hideMark/>
+          </w:tcPr>
+          <w:p>
+            <w:pPr>
+              <w:rPr>
+                <w:rFonts w:ascii="Cambria" w:hAnsi="Cambria"/>
+              </w:rPr>
+            </w:pPr>
+            <w:r>
+              <w:rPr>
+                <w:rFonts w:ascii="Cambria" w:hAnsi="Cambria"/>
+              </w:rPr>
+              <w:t>Caso algum requisito da norma não seja aplicável, justifique tecnicamente a exclusão.</w:t>
+            </w:r>
+          </w:p>
+        </w:tc>
+        <w:tc>
+          <w:tcPr>
+            <w:tcW w:w="0" w:type="auto"/>
+            <w:vAlign w:val="center"/>
+            <w:hideMark/>
+          </w:tcPr>
+          <w:p>
+            <w:pPr>
+              <w:rPr>
+                <w:rFonts w:ascii="Cambria" w:hAnsi="Cambria"/>
+              </w:rPr>
+            </w:pPr>
+            <w:r>
+              <w:rPr>
+                <w:rFonts w:ascii="Cambria" w:hAnsi="Cambria"/>
+              </w:rPr>
+              <w:t>Existe algum requisito que realmente não se aplica à organização?</w:t>
+            </w:r>
+          </w:p>
+        </w:tc>
+      </w:tr>
+      <w:tr>
+        <w:trPr>
+          <w:tblCellSpacing w:w="15" w:type="dxa"/>
+        </w:trPr>
+        <w:tc>
+          <w:tcPr>
+            <w:tcW w:w="0" w:type="auto"/>
+            <w:vAlign w:val="center"/>
+            <w:hideMark/>
+          </w:tcPr>
+          <w:p>
+            <w:pPr>
+              <w:rPr>
+                <w:rFonts w:ascii="Cambria" w:hAnsi="Cambria"/>
+              </w:rPr>
+            </w:pPr>
+            <w:r>
+              <w:rPr>
+                <w:rFonts w:ascii="Cambria" w:hAnsi="Cambria"/>
+              </w:rPr>
+              <w:t>7. Elaborar a declaração do âmbito</w:t>
+            </w:r>
+          </w:p>
+        </w:tc>
+        <w:tc>
+          <w:tcPr>
+            <w:tcW w:w="0" w:type="auto"/>
+            <w:vAlign w:val="center"/>
+            <w:hideMark/>
+          </w:tcPr>
+          <w:p>
+            <w:pPr>
+              <w:rPr>
+                <w:rFonts w:ascii="Cambria" w:hAnsi="Cambria"/>
+              </w:rPr>
+            </w:pPr>
+            <w:r>
+              <w:rPr>
+                <w:rFonts w:ascii="Cambria" w:hAnsi="Cambria"/>
+              </w:rPr>
+              <w:t>Escreva um texto claro, objetivo e sem ambiguidades.</w:t>
+            </w:r>
+          </w:p>
+        </w:tc>
+        <w:tc>
+          <w:tcPr>
+            <w:tcW w:w="0" w:type="auto"/>
+            <w:vAlign w:val="center"/>
+            <w:hideMark/>
+          </w:tcPr>
+          <w:p>
+            <w:pPr>
+              <w:rPr>
+                <w:rFonts w:ascii="Cambria" w:hAnsi="Cambria"/>
+              </w:rPr>
+            </w:pPr>
+            <w:r>
+              <w:rPr>
+                <w:rFonts w:ascii="Cambria" w:hAnsi="Cambria"/>
+              </w:rPr>
+              <w:t>Uma pessoa externa consegue compreender exatamente o que faz parte do Sistema de Gestão?</w:t>
+            </w:r>
+          </w:p>
+        </w:tc>
+      </w:tr>
+    </w:tbl>
+    <w:p>
+      <w:pPr>
+        <w:rPr>
+          <w:rFonts w:ascii="Cambria" w:hAnsi="Cambria"/>
+        </w:rPr>
+      </w:pPr>
+    </w:p>
+    <w:p>
+      <w:pPr>
+        <w:rPr>
+          <w:rFonts w:ascii="Cambria" w:hAnsi="Cambria"/>
+        </w:rPr>
+      </w:pPr>
+    </w:p>
+    <w:p>
+      <w:pPr>
+        <w:rPr>
+          <w:rFonts w:ascii="Cambria" w:hAnsi="Cambria"/>
+        </w:rPr>
+      </w:pPr>
+    </w:p>
+    <w:p>
+      <w:pPr>
+        <w:rPr>
+          <w:rFonts w:ascii="Cambria" w:hAnsi="Cambria"/>
+        </w:rPr>
+      </w:pPr>
+    </w:p>
+    <w:p>
+      <w:pPr>
+        <w:rPr>
+          <w:rFonts w:ascii="Cambria" w:hAnsi="Cambria"/>
+        </w:rPr>
+      </w:pPr>
+      <w:r>
+        <w:rPr>
+          <w:rFonts w:ascii="Cambria" w:hAnsi="Cambria"/>
+        </w:rPr>
+        <w:t>O QUE DEVE CONSTAR NO ÂMBITO?</w:t>
+      </w:r>
+    </w:p>
+    <w:tbl>
+      <w:tblPr>
+        <w:tblW w:w="0" w:type="auto"/>
+        <w:tblCellSpacing w:w="15" w:type="dxa"/>
+        <w:tblBorders>
+          <w:top w:val="single" w:sz="4" w:space="0" w:color="auto"/>
+          <w:left w:val="single" w:sz="4" w:space="0" w:color="auto"/>
+          <w:bottom w:val="single" w:sz="4" w:space="0" w:color="auto"/>
+          <w:right w:val="single" w:sz="4" w:space="0" w:color="auto"/>
+          <w:insideH w:val="single" w:sz="4" w:space="0" w:color="auto"/>
+          <w:insideV w:val="single" w:sz="4" w:space="0" w:color="auto"/>
+        </w:tblBorders>
+        <w:tblCellMar>
+          <w:top w:w="15" w:type="dxa"/>
+          <w:left w:w="15" w:type="dxa"/>
+          <w:bottom w:w="15" w:type="dxa"/>
+          <w:right w:w="15" w:type="dxa"/>
+        </w:tblCellMar>
+        <w:tblLook w:val="04A0" w:firstRow="1" w:lastRow="0" w:firstColumn="1" w:lastColumn="0" w:noHBand="0" w:noVBand="1"/>
+      </w:tblPr>
+      <w:tblGrid>
+        <w:gridCol w:w="2385"/>
+        <w:gridCol w:w="6109"/>
+      </w:tblGrid>
+      <w:tr>
+        <w:trPr>
+          <w:tblHeader/>
+          <w:tblCellSpacing w:w="15" w:type="dxa"/>
+        </w:trPr>
+        <w:tc>
+          <w:tcPr>
+            <w:tcW w:w="0" w:type="auto"/>
+            <w:vAlign w:val="center"/>
+            <w:hideMark/>
+          </w:tcPr>
+          <w:p>
+            <w:pPr>
+              <w:rPr>
+                <w:rFonts w:ascii="Cambria" w:hAnsi="Cambria"/>
+              </w:rPr>
+            </w:pPr>
+            <w:r>
+              <w:rPr>
+                <w:rFonts w:ascii="Cambria" w:hAnsi="Cambria"/>
+              </w:rPr>
+              <w:t>Deve conter</w:t>
+            </w:r>
+          </w:p>
+        </w:tc>
+        <w:tc>
+          <w:tcPr>
+            <w:tcW w:w="0" w:type="auto"/>
+            <w:vAlign w:val="center"/>
+            <w:hideMark/>
+          </w:tcPr>
+          <w:p>
+            <w:pPr>
+              <w:rPr>
+                <w:rFonts w:ascii="Cambria" w:hAnsi="Cambria"/>
+              </w:rPr>
+            </w:pPr>
+            <w:r>
+              <w:rPr>
+                <w:rFonts w:ascii="Cambria" w:hAnsi="Cambria"/>
+              </w:rPr>
+              <w:t>Exemplo</w:t>
+            </w:r>
+          </w:p>
+        </w:tc>
+      </w:tr>
+      <w:tr>
+        <w:trPr>
+          <w:tblCellSpacing w:w="15" w:type="dxa"/>
+        </w:trPr>
+        <w:tc>
+          <w:tcPr>
+            <w:tcW w:w="0" w:type="auto"/>
+            <w:vAlign w:val="center"/>
+            <w:hideMark/>
+          </w:tcPr>
+          <w:p>
+            <w:pPr>
+              <w:rPr>
+                <w:rFonts w:ascii="Cambria" w:hAnsi="Cambria"/>
+              </w:rPr>
+            </w:pPr>
+            <w:r>
+              <w:rPr>
+                <w:rFonts w:ascii="Cambria" w:hAnsi="Cambria"/>
+              </w:rPr>
+              <w:t>Atividade principal</w:t>
+            </w:r>
+          </w:p>
+        </w:tc>
+        <w:tc>
+          <w:tcPr>
+            <w:tcW w:w="0" w:type="auto"/>
+            <w:vAlign w:val="center"/>
+            <w:hideMark/>
+          </w:tcPr>
+          <w:p>
+            <w:pPr>
+              <w:rPr>
+                <w:rFonts w:ascii="Cambria" w:hAnsi="Cambria"/>
+              </w:rPr>
+            </w:pPr>
+            <w:r>
+              <w:rPr>
+                <w:rFonts w:ascii="Cambria" w:hAnsi="Cambria"/>
+              </w:rPr>
+              <w:t>Produção de produtos alimentares.</w:t>
+            </w:r>
+          </w:p>
+        </w:tc>
+      </w:tr>
+      <w:tr>
+        <w:trPr>
+          <w:tblCellSpacing w:w="15" w:type="dxa"/>
+        </w:trPr>
+        <w:tc>
+          <w:tcPr>
+            <w:tcW w:w="0" w:type="auto"/>
+            <w:vAlign w:val="center"/>
+            <w:hideMark/>
+          </w:tcPr>
+          <w:p>
+            <w:pPr>
+              <w:rPr>
+                <w:rFonts w:ascii="Cambria" w:hAnsi="Cambria"/>
+              </w:rPr>
+            </w:pPr>
+            <w:r>
+              <w:rPr>
+                <w:rFonts w:ascii="Cambria" w:hAnsi="Cambria"/>
+              </w:rPr>
+              <w:t>Produtos ou serviços</w:t>
+            </w:r>
+          </w:p>
+        </w:tc>
+        <w:tc>
+          <w:tcPr>
+            <w:tcW w:w="0" w:type="auto"/>
+            <w:vAlign w:val="center"/>
+            <w:hideMark/>
+          </w:tcPr>
+          <w:p>
+            <w:pPr>
+              <w:rPr>
+                <w:rFonts w:ascii="Cambria" w:hAnsi="Cambria"/>
+              </w:rPr>
+            </w:pPr>
+            <w:r>
+              <w:rPr>
+                <w:rFonts w:ascii="Cambria" w:hAnsi="Cambria"/>
+              </w:rPr>
+              <w:t>Fabrico e comercialização de enchidos.</w:t>
+            </w:r>
+          </w:p>
+        </w:tc>
+      </w:tr>
+      <w:tr>
+        <w:trPr>
+          <w:tblCellSpacing w:w="15" w:type="dxa"/>
+        </w:trPr>
+        <w:tc>
+          <w:tcPr>
+            <w:tcW w:w="0" w:type="auto"/>
+            <w:vAlign w:val="center"/>
+            <w:hideMark/>
+          </w:tcPr>
+          <w:p>
+            <w:pPr>
+              <w:rPr>
+                <w:rFonts w:ascii="Cambria" w:hAnsi="Cambria"/>
+              </w:rPr>
+            </w:pPr>
+            <w:r>
+              <w:rPr>
+                <w:rFonts w:ascii="Cambria" w:hAnsi="Cambria"/>
+              </w:rPr>
+              <w:t>Processos abrangidos</w:t>
+            </w:r>
+          </w:p>
+        </w:tc>
+        <w:tc>
+          <w:tcPr>
+            <w:tcW w:w="0" w:type="auto"/>
+            <w:vAlign w:val="center"/>
+            <w:hideMark/>
+          </w:tcPr>
+          <w:p>
+            <w:pPr>
+              <w:rPr>
+                <w:rFonts w:ascii="Cambria" w:hAnsi="Cambria"/>
+              </w:rPr>
+            </w:pPr>
+            <w:r>
+              <w:rPr>
+                <w:rFonts w:ascii="Cambria" w:hAnsi="Cambria"/>
+              </w:rPr>
+              <w:t>Compras, Produção, Qualidade, Armazém, Expedição, Recursos Humanos e Manutenção.</w:t>
+            </w:r>
+          </w:p>
+        </w:tc>
+      </w:tr>
+      <w:tr>
+        <w:trPr>
+          <w:tblCellSpacing w:w="15" w:type="dxa"/>
+        </w:trPr>
+        <w:tc>
+          <w:tcPr>
+            <w:tcW w:w="0" w:type="auto"/>
+            <w:vAlign w:val="center"/>
+            <w:hideMark/>
+          </w:tcPr>
+          <w:p>
+            <w:pPr>
+              <w:rPr>
+                <w:rFonts w:ascii="Cambria" w:hAnsi="Cambria"/>
+              </w:rPr>
+            </w:pPr>
+            <w:r>
+              <w:rPr>
+                <w:rFonts w:ascii="Cambria" w:hAnsi="Cambria"/>
+              </w:rPr>
+              <w:t>Localizações</w:t>
+            </w:r>
+          </w:p>
+        </w:tc>
+        <w:tc>
+          <w:tcPr>
+            <w:tcW w:w="0" w:type="auto"/>
+            <w:vAlign w:val="center"/>
+            <w:hideMark/>
+          </w:tcPr>
+          <w:p>
+            <w:pPr>
+              <w:rPr>
+                <w:rFonts w:ascii="Cambria" w:hAnsi="Cambria"/>
+              </w:rPr>
+            </w:pPr>
+            <w:r>
+              <w:rPr>
+                <w:rFonts w:ascii="Cambria" w:hAnsi="Cambria"/>
+              </w:rPr>
+              <w:t>Unidade industrial localizada em Coimbra.</w:t>
+            </w:r>
+          </w:p>
+        </w:tc>
+      </w:tr>
+      <w:tr>
+        <w:trPr>
+          <w:tblCellSpacing w:w="15" w:type="dxa"/>
+        </w:trPr>
+        <w:tc>
+          <w:tcPr>
+            <w:tcW w:w="0" w:type="auto"/>
+            <w:vAlign w:val="center"/>
+            <w:hideMark/>
+          </w:tcPr>
+          <w:p>
+            <w:pPr>
+              <w:rPr>
+                <w:rFonts w:ascii="Cambria" w:hAnsi="Cambria"/>
+              </w:rPr>
+            </w:pPr>
+            <w:r>
+              <w:rPr>
+                <w:rFonts w:ascii="Cambria" w:hAnsi="Cambria"/>
+              </w:rPr>
+              <w:t>Sistema(s) de Gestão</w:t>
+            </w:r>
+          </w:p>
+        </w:tc>
+        <w:tc>
+          <w:tcPr>
+            <w:tcW w:w="0" w:type="auto"/>
+            <w:vAlign w:val="center"/>
+            <w:hideMark/>
+          </w:tcPr>
+          <w:p>
+            <w:pPr>
+              <w:rPr>
+                <w:rFonts w:ascii="Cambria" w:hAnsi="Cambria"/>
+              </w:rPr>
+            </w:pPr>
+            <w:r>
+              <w:rPr>
+                <w:rFonts w:ascii="Cambria" w:hAnsi="Cambria"/>
+              </w:rPr>
+              <w:t>ISO 9001, ISO 14001, ISO 45001 e/ou outras normas implementadas.</w:t>
+            </w:r>
+          </w:p>
+        </w:tc>
+      </w:tr>
+      <w:tr>
+        <w:trPr>
+          <w:tblCellSpacing w:w="15" w:type="dxa"/>
+        </w:trPr>
+        <w:tc>
+          <w:tcPr>
+            <w:tcW w:w="0" w:type="auto"/>
+            <w:vAlign w:val="center"/>
+            <w:hideMark/>
+          </w:tcPr>
+          <w:p>
+            <w:pPr>
+              <w:rPr>
+                <w:rFonts w:ascii="Cambria" w:hAnsi="Cambria"/>
+              </w:rPr>
+            </w:pPr>
+            <w:r>
+              <w:rPr>
+                <w:rFonts w:ascii="Cambria" w:hAnsi="Cambria"/>
+              </w:rPr>
+              <w:t>Exclusões (quando aplicável)</w:t>
+            </w:r>
+          </w:p>
+        </w:tc>
+        <w:tc>
+          <w:tcPr>
+            <w:tcW w:w="0" w:type="auto"/>
+            <w:vAlign w:val="center"/>
+            <w:hideMark/>
+          </w:tcPr>
+          <w:p>
+            <w:pPr>
+              <w:rPr>
+                <w:rFonts w:ascii="Cambria" w:hAnsi="Cambria"/>
+              </w:rPr>
+            </w:pPr>
+            <w:r>
+              <w:rPr>
+                <w:rFonts w:ascii="Cambria" w:hAnsi="Cambria"/>
+              </w:rPr>
+              <w:t>Justificação fundamentada de requisitos não aplicáveis.</w:t>
+            </w:r>
+          </w:p>
+        </w:tc>
+      </w:tr>
+    </w:tbl>
+    <w:p>
+      <w:pPr>
+        <w:rPr>
+          <w:rFonts w:ascii="Cambria" w:hAnsi="Cambria"/>
+        </w:rPr>
+      </w:pPr>
+    </w:p>
+    <w:p>
+      <w:pPr>
+        <w:rPr>
+          <w:rFonts w:ascii="Cambria" w:hAnsi="Cambria"/>
+        </w:rPr>
+      </w:pPr>
+      <w:r>
+        <w:rPr>
+          <w:rFonts w:ascii="Cambria" w:hAnsi="Cambria"/>
+        </w:rPr>
+        <w:t>BOAS PRÁTICAS</w:t>
+      </w:r>
+    </w:p>
+    <w:tbl>
+      <w:tblPr>
+        <w:tblW w:w="0" w:type="auto"/>
+        <w:tblCellSpacing w:w="15" w:type="dxa"/>
+        <w:tblBorders>
+          <w:top w:val="single" w:sz="4" w:space="0" w:color="auto"/>
+          <w:left w:val="single" w:sz="4" w:space="0" w:color="auto"/>
+          <w:bottom w:val="single" w:sz="4" w:space="0" w:color="auto"/>
+          <w:right w:val="single" w:sz="4" w:space="0" w:color="auto"/>
+          <w:insideH w:val="single" w:sz="4" w:space="0" w:color="auto"/>
+          <w:insideV w:val="single" w:sz="4" w:space="0" w:color="auto"/>
+        </w:tblBorders>
+        <w:tblCellMar>
+          <w:top w:w="15" w:type="dxa"/>
+          <w:left w:w="15" w:type="dxa"/>
+          <w:bottom w:w="15" w:type="dxa"/>
+          <w:right w:w="15" w:type="dxa"/>
+        </w:tblCellMar>
+        <w:tblLook w:val="04A0" w:firstRow="1" w:lastRow="0" w:firstColumn="1" w:lastColumn="0" w:noHBand="0" w:noVBand="1"/>
+      </w:tblPr>
+      <w:tblGrid>
+        <w:gridCol w:w="4528"/>
+        <w:gridCol w:w="3966"/>
+      </w:tblGrid>
+      <w:tr>
+        <w:trPr>
+          <w:tblHeader/>
+          <w:tblCellSpacing w:w="15" w:type="dxa"/>
+        </w:trPr>
+        <w:tc>
+          <w:tcPr>
+            <w:tcW w:w="0" w:type="auto"/>
+            <w:vAlign w:val="center"/>
+            <w:hideMark/>
+          </w:tcPr>
+          <w:p>
+            <w:pPr>
+              <w:rPr>
+                <w:rFonts w:ascii="Cambria" w:hAnsi="Cambria"/>
+              </w:rPr>
+            </w:pPr>
+            <w:r>
+              <w:rPr>
+                <w:rFonts w:ascii="Cambria" w:hAnsi="Cambria"/>
+              </w:rPr>
+              <w:t>Faça</w:t>
+            </w:r>
+          </w:p>
+        </w:tc>
+        <w:tc>
+          <w:tcPr>
+            <w:tcW w:w="0" w:type="auto"/>
+            <w:vAlign w:val="center"/>
+            <w:hideMark/>
+          </w:tcPr>
+          <w:p>
+            <w:pPr>
+              <w:rPr>
+                <w:rFonts w:ascii="Cambria" w:hAnsi="Cambria"/>
+              </w:rPr>
+            </w:pPr>
+            <w:r>
+              <w:rPr>
+                <w:rFonts w:ascii="Cambria" w:hAnsi="Cambria"/>
+              </w:rPr>
+              <w:t>Evite</w:t>
+            </w:r>
+          </w:p>
+        </w:tc>
+      </w:tr>
+      <w:tr>
+        <w:trPr>
+          <w:tblCellSpacing w:w="15" w:type="dxa"/>
+        </w:trPr>
+        <w:tc>
+          <w:tcPr>
+            <w:tcW w:w="0" w:type="auto"/>
+            <w:vAlign w:val="center"/>
+            <w:hideMark/>
+          </w:tcPr>
+          <w:p>
+            <w:pPr>
+              <w:rPr>
+                <w:rFonts w:ascii="Cambria" w:hAnsi="Cambria"/>
+              </w:rPr>
+            </w:pPr>
+            <w:r>
+              <w:rPr>
+                <w:rFonts w:ascii="Cambria" w:hAnsi="Cambria"/>
+              </w:rPr>
+              <w:t>Escreva de forma clara e objetiva.</w:t>
+            </w:r>
+          </w:p>
+        </w:tc>
+        <w:tc>
+          <w:tcPr>
+            <w:tcW w:w="0" w:type="auto"/>
+            <w:vAlign w:val="center"/>
+            <w:hideMark/>
+          </w:tcPr>
+          <w:p>
+            <w:pPr>
+              <w:rPr>
+                <w:rFonts w:ascii="Cambria" w:hAnsi="Cambria"/>
+              </w:rPr>
+            </w:pPr>
+            <w:r>
+              <w:rPr>
+                <w:rFonts w:ascii="Cambria" w:hAnsi="Cambria"/>
+              </w:rPr>
+              <w:t>Escrever textos demasiado longos.</w:t>
+            </w:r>
+          </w:p>
+        </w:tc>
+      </w:tr>
+      <w:tr>
+        <w:trPr>
+          <w:tblCellSpacing w:w="15" w:type="dxa"/>
+        </w:trPr>
+        <w:tc>
+          <w:tcPr>
+            <w:tcW w:w="0" w:type="auto"/>
+            <w:vAlign w:val="center"/>
+            <w:hideMark/>
+          </w:tcPr>
+          <w:p>
+            <w:pPr>
+              <w:rPr>
+                <w:rFonts w:ascii="Cambria" w:hAnsi="Cambria"/>
+              </w:rPr>
+            </w:pPr>
+            <w:r>
+              <w:rPr>
+                <w:rFonts w:ascii="Cambria" w:hAnsi="Cambria"/>
+              </w:rPr>
+              <w:t>Descreva apenas aquilo que realmente faz parte do Sistema de Gestão.</w:t>
+            </w:r>
+          </w:p>
+        </w:tc>
+        <w:tc>
+          <w:tcPr>
+            <w:tcW w:w="0" w:type="auto"/>
+            <w:vAlign w:val="center"/>
+            <w:hideMark/>
+          </w:tcPr>
+          <w:p>
+            <w:pPr>
+              <w:rPr>
+                <w:rFonts w:ascii="Cambria" w:hAnsi="Cambria"/>
+              </w:rPr>
+            </w:pPr>
+            <w:r>
+              <w:rPr>
+                <w:rFonts w:ascii="Cambria" w:hAnsi="Cambria"/>
+              </w:rPr>
+              <w:t>Incluir atividades que não são realizadas pela organização.</w:t>
+            </w:r>
+          </w:p>
+        </w:tc>
+      </w:tr>
+      <w:tr>
+        <w:trPr>
+          <w:tblCellSpacing w:w="15" w:type="dxa"/>
+        </w:trPr>
+        <w:tc>
+          <w:tcPr>
+            <w:tcW w:w="0" w:type="auto"/>
+            <w:vAlign w:val="center"/>
+            <w:hideMark/>
+          </w:tcPr>
+          <w:p>
+            <w:pPr>
+              <w:rPr>
+                <w:rFonts w:ascii="Cambria" w:hAnsi="Cambria"/>
+              </w:rPr>
+            </w:pPr>
+            <w:r>
+              <w:rPr>
+                <w:rFonts w:ascii="Cambria" w:hAnsi="Cambria"/>
+              </w:rPr>
+              <w:t>Considere o contexto e as partes interessadas.</w:t>
+            </w:r>
+          </w:p>
+        </w:tc>
+        <w:tc>
+          <w:tcPr>
+            <w:tcW w:w="0" w:type="auto"/>
+            <w:vAlign w:val="center"/>
+            <w:hideMark/>
+          </w:tcPr>
+          <w:p>
+            <w:pPr>
+              <w:rPr>
+                <w:rFonts w:ascii="Cambria" w:hAnsi="Cambria"/>
+              </w:rPr>
+            </w:pPr>
+            <w:r>
+              <w:rPr>
+                <w:rFonts w:ascii="Cambria" w:hAnsi="Cambria"/>
+              </w:rPr>
+              <w:t>Definir o âmbito sem analisar os requisitos 4.1 e 4.2.</w:t>
+            </w:r>
+          </w:p>
+        </w:tc>
+      </w:tr>
+      <w:tr>
+        <w:trPr>
+          <w:tblCellSpacing w:w="15" w:type="dxa"/>
+        </w:trPr>
+        <w:tc>
+          <w:tcPr>
+            <w:tcW w:w="0" w:type="auto"/>
+            <w:vAlign w:val="center"/>
+            <w:hideMark/>
+          </w:tcPr>
+          <w:p>
+            <w:pPr>
+              <w:rPr>
+                <w:rFonts w:ascii="Cambria" w:hAnsi="Cambria"/>
+              </w:rPr>
+            </w:pPr>
+            <w:r>
+              <w:rPr>
+                <w:rFonts w:ascii="Cambria" w:hAnsi="Cambria"/>
+              </w:rPr>
+              <w:t>Atualize o âmbito sempre que existirem alterações relevantes.</w:t>
+            </w:r>
+          </w:p>
+        </w:tc>
+        <w:tc>
+          <w:tcPr>
+            <w:tcW w:w="0" w:type="auto"/>
+            <w:vAlign w:val="center"/>
+            <w:hideMark/>
+          </w:tcPr>
+          <w:p>
+            <w:pPr>
+              <w:rPr>
+                <w:rFonts w:ascii="Cambria" w:hAnsi="Cambria"/>
+              </w:rPr>
+            </w:pPr>
+            <w:r>
+              <w:rPr>
+                <w:rFonts w:ascii="Cambria" w:hAnsi="Cambria"/>
+              </w:rPr>
+              <w:t>Manter um âmbito desatualizado.</w:t>
+            </w:r>
+          </w:p>
+        </w:tc>
+      </w:tr>
+    </w:tbl>
+    <w:p>
+      <w:pPr>
+        <w:rPr>
+          <w:rFonts w:ascii="Cambria" w:hAnsi="Cambria"/>
+        </w:rPr>
+      </w:pPr>
+    </w:p>
+    <w:p>
+      <w:pPr>
+        <w:rPr>
+          <w:rFonts w:ascii="Cambria" w:hAnsi="Cambria"/>
+        </w:rPr>
+      </w:pPr>
+      <w:r>
+        <w:rPr>
+          <w:rFonts w:ascii="Cambria" w:hAnsi="Cambria"/>
+          <w:b/>
+          <w:bCs/>
+        </w:rPr>
+        <w:t>IMPORTANTE</w:t>
+      </w:r>
+      <w:r>
+        <w:rPr>
+          <w:rFonts w:ascii="Cambria" w:hAnsi="Cambria"/>
+        </w:rPr>
+        <w:t xml:space="preserve">: </w:t>
+      </w:r>
+    </w:p>
+    <w:p>
+      <w:pPr>
         <w:rPr>
           <w:rFonts w:ascii="Cambria" w:hAnsi="Cambria"/>
           <w:b/>
@@ -17,31 +1287,90 @@
       <w:r>
         <w:rPr>
           <w:rFonts w:ascii="Cambria" w:hAnsi="Cambria"/>
+        </w:rPr>
+        <w:t>O âmbito deve responder, de forma clara, às seguintes perguntas: Quem é a organização? O que faz? Onde atua? Quais atividades fazem parte do Sistema de Gestão? Quais normas são abrangidas? Se estas respostas estiverem claras, o âmbito estará bem definido.</w:t>
+      </w:r>
+      <w:r>
+        <w:rPr>
+          <w:rFonts w:ascii="Cambria" w:hAnsi="Cambria"/>
           <w:b/>
           <w:bCs/>
           <w:sz w:val="32"/>
           <w:szCs w:val="32"/>
         </w:rPr>
-        <w:t>ÂMBITO DO SISTEMA DE GESTÃO INTEGRADO</w:t>
-      </w:r>
-    </w:p>
-    <w:p>
-      <w:pPr>
-        <w:rPr>
-          <w:rFonts w:ascii="Cambria" w:hAnsi="Cambria"/>
-        </w:rPr>
-      </w:pPr>
-      <w:r>
-        <w:rPr>
-          <w:rFonts w:ascii="Cambria" w:hAnsi="Cambria"/>
-        </w:rPr>
-        <w:t xml:space="preserve">O Sistema de Gestão Integrado (SGI) da </w:t>
-      </w:r>
-      <w:r>
+        <w:br w:type="page"/>
+      </w:r>
+    </w:p>
+    <w:p>
+      <w:pPr>
+        <w:spacing w:before="240" w:line="240" w:lineRule="auto"/>
+        <w:jc w:val="center"/>
         <w:rPr>
           <w:rFonts w:ascii="Cambria" w:hAnsi="Cambria"/>
           <w:b/>
           <w:bCs/>
+          <w:sz w:val="32"/>
+          <w:szCs w:val="32"/>
+        </w:rPr>
+      </w:pPr>
+    </w:p>
+    <w:p>
+      <w:pPr>
+        <w:spacing w:before="240" w:line="240" w:lineRule="auto"/>
+        <w:jc w:val="center"/>
+        <w:rPr>
+          <w:rFonts w:ascii="Cambria" w:hAnsi="Cambria"/>
+          <w:b/>
+          <w:bCs/>
+          <w:sz w:val="32"/>
+          <w:szCs w:val="32"/>
+        </w:rPr>
+      </w:pPr>
+      <w:r>
+        <w:rPr>
+          <w:rFonts w:ascii="Cambria" w:hAnsi="Cambria"/>
+          <w:b/>
+          <w:bCs/>
+          <w:sz w:val="32"/>
+          <w:szCs w:val="32"/>
+        </w:rPr>
+        <w:t xml:space="preserve">MODELO </w:t>
+      </w:r>
+      <w:r>
+        <w:rPr>
+          <w:rFonts w:ascii="Cambria" w:hAnsi="Cambria"/>
+          <w:b/>
+          <w:bCs/>
+          <w:sz w:val="32"/>
+          <w:szCs w:val="32"/>
+        </w:rPr>
+        <w:t>ÂMBITO DO SISTEMA DE GESTÃO INTEGRADO</w:t>
+      </w:r>
+    </w:p>
+    <w:p>
+      <w:pPr>
+        <w:rPr>
+          <w:rFonts w:ascii="Cambria" w:hAnsi="Cambria"/>
+        </w:rPr>
+      </w:pPr>
+      <w:r>
+        <w:rPr>
+          <w:rFonts w:ascii="Cambria" w:hAnsi="Cambria"/>
+        </w:rPr>
+        <w:t xml:space="preserve">O Sistema de Gestão Integrado (SGI) </w:t>
+      </w:r>
+      <w:commentRangeStart w:id="0"/>
+      <w:r>
+        <w:rPr>
+          <w:rFonts w:ascii="Cambria" w:hAnsi="Cambria"/>
+        </w:rPr>
+        <w:t xml:space="preserve">da </w:t>
+      </w:r>
+      <w:r>
+        <w:rPr>
+          <w:rFonts w:ascii="Cambria" w:hAnsi="Cambria"/>
+          <w:b/>
+          <w:bCs/>
         </w:rPr>
         <w:t>------------------------------</w:t>
       </w:r>
@@ -49,7 +1378,30 @@
         <w:rPr>
           <w:rFonts w:ascii="Cambria" w:hAnsi="Cambria"/>
         </w:rPr>
-        <w:t xml:space="preserve"> aplica-se às atividades de </w:t>
+        <w:t xml:space="preserve"> </w:t>
+      </w:r>
+      <w:commentRangeEnd w:id="0"/>
+      <w:r>
+        <w:rPr>
+          <w:rStyle w:val="Refdecomentrio"/>
+          <w:rFonts w:ascii="Cambria" w:hAnsi="Cambria"/>
+          <w:sz w:val="24"/>
+          <w:szCs w:val="24"/>
+        </w:rPr>
+        <w:commentReference w:id="0"/>
+      </w:r>
+      <w:r>
+        <w:rPr>
+          <w:rFonts w:ascii="Cambria" w:hAnsi="Cambria"/>
+        </w:rPr>
+        <w:t xml:space="preserve">aplica-se às atividades </w:t>
+      </w:r>
+      <w:commentRangeStart w:id="1"/>
+      <w:r>
+        <w:rPr>
+          <w:rFonts w:ascii="Cambria" w:hAnsi="Cambria"/>
+        </w:rPr>
+        <w:t xml:space="preserve">de </w:t>
       </w:r>
       <w:r>
         <w:rPr>
@@ -61,7 +1413,23 @@
         <w:rPr>
           <w:rFonts w:ascii="Cambria" w:hAnsi="Cambria"/>
         </w:rPr>
-        <w:t>, desenvolvidas na</w:t>
+        <w:t xml:space="preserve">, </w:t>
+      </w:r>
+      <w:commentRangeEnd w:id="1"/>
+      <w:r>
+        <w:rPr>
+          <w:rStyle w:val="Refdecomentrio"/>
+          <w:rFonts w:ascii="Cambria" w:hAnsi="Cambria"/>
+          <w:sz w:val="24"/>
+          <w:szCs w:val="24"/>
+        </w:rPr>
+        <w:commentReference w:id="1"/>
+      </w:r>
+      <w:r>
+        <w:rPr>
+          <w:rFonts w:ascii="Cambria" w:hAnsi="Cambria"/>
+        </w:rPr>
+        <w:t>desenvolvidas na</w:t>
       </w:r>
       <w:r>
         <w:rPr>
@@ -99,24 +1467,42 @@
         </w:rPr>
         <w:t xml:space="preserve"> </w:t>
       </w:r>
+      <w:commentRangeStart w:id="2"/>
       <w:r>
         <w:rPr>
           <w:rFonts w:ascii="Cambria" w:hAnsi="Cambria"/>
         </w:rPr>
         <w:t>-------------------------------------------------.</w:t>
       </w:r>
-    </w:p>
-    <w:p>
-      <w:pPr>
-        <w:rPr>
-          <w:rFonts w:ascii="Cambria" w:hAnsi="Cambria"/>
-        </w:rPr>
-      </w:pPr>
-      <w:r>
-        <w:rPr>
-          <w:rFonts w:ascii="Cambria" w:hAnsi="Cambria"/>
-        </w:rPr>
-        <w:t xml:space="preserve">O âmbito do SGI abrange todos os processos de suporte e operacionais que influenciam </w:t>
+      <w:commentRangeEnd w:id="2"/>
+      <w:r>
+        <w:rPr>
+          <w:rStyle w:val="Refdecomentrio"/>
+          <w:rFonts w:ascii="Cambria" w:hAnsi="Cambria"/>
+          <w:sz w:val="24"/>
+          <w:szCs w:val="24"/>
+        </w:rPr>
+        <w:commentReference w:id="2"/>
+      </w:r>
+    </w:p>
+    <w:p>
+      <w:pPr>
+        <w:rPr>
+          <w:rFonts w:ascii="Cambria" w:hAnsi="Cambria"/>
+        </w:rPr>
+      </w:pPr>
+      <w:r>
+        <w:rPr>
+          <w:rFonts w:ascii="Cambria" w:hAnsi="Cambria"/>
+        </w:rPr>
+        <w:t xml:space="preserve">O âmbito do SGI abrange todos os processos de suporte e operacionais que </w:t>
+      </w:r>
+      <w:commentRangeStart w:id="3"/>
+      <w:r>
+        <w:rPr>
+          <w:rFonts w:ascii="Cambria" w:hAnsi="Cambria"/>
+        </w:rPr>
+        <w:t xml:space="preserve">influenciam </w:t>
       </w:r>
       <w:r>
         <w:rPr>
@@ -135,6 +1521,16 @@
           <w:rFonts w:ascii="Cambria" w:hAnsi="Cambria"/>
         </w:rPr>
         <w:t>-------------------------------------------------------------------------------------------------------</w:t>
+      </w:r>
+      <w:commentRangeEnd w:id="3"/>
+      <w:r>
+        <w:rPr>
+          <w:rStyle w:val="Refdecomentrio"/>
+          <w:rFonts w:ascii="Cambria" w:hAnsi="Cambria"/>
+          <w:sz w:val="24"/>
+          <w:szCs w:val="24"/>
+        </w:rPr>
+        <w:commentReference w:id="3"/>
       </w:r>
     </w:p>
     <w:p>
@@ -275,11 +1671,22 @@
           <w:rFonts w:ascii="Cambria" w:hAnsi="Cambria"/>
         </w:rPr>
       </w:pPr>
+      <w:commentRangeStart w:id="4"/>
       <w:r>
         <w:rPr>
           <w:rFonts w:ascii="Cambria" w:hAnsi="Cambria"/>
         </w:rPr>
         <w:t>------------------------------------------------------------------------</w:t>
+      </w:r>
+      <w:commentRangeEnd w:id="4"/>
+      <w:r>
+        <w:rPr>
+          <w:rStyle w:val="Refdecomentrio"/>
+          <w:rFonts w:ascii="Cambria" w:hAnsi="Cambria"/>
+          <w:sz w:val="24"/>
+          <w:szCs w:val="24"/>
+        </w:rPr>
+        <w:commentReference w:id="4"/>
       </w:r>
     </w:p>
     <w:p>
@@ -362,7 +1769,24 @@
         <w:rPr>
           <w:rFonts w:ascii="Cambria" w:hAnsi="Cambria"/>
         </w:rPr>
-        <w:t>----------------------------------------</w:t>
+        <w:t>-</w:t>
+      </w:r>
+      <w:commentRangeStart w:id="5"/>
+      <w:r>
+        <w:rPr>
+          <w:rFonts w:ascii="Cambria" w:hAnsi="Cambria"/>
+        </w:rPr>
+        <w:t>---------------------------------------</w:t>
+      </w:r>
+      <w:commentRangeEnd w:id="5"/>
+      <w:r>
+        <w:rPr>
+          <w:rStyle w:val="Refdecomentrio"/>
+          <w:rFonts w:ascii="Cambria" w:hAnsi="Cambria"/>
+          <w:sz w:val="24"/>
+          <w:szCs w:val="24"/>
+        </w:rPr>
+        <w:commentReference w:id="5"/>
       </w:r>
       <w:r>
         <w:rPr>
@@ -378,6 +1802,7 @@
         </w:rPr>
         <w:t xml:space="preserve">não existem exclusões aos requisitos aplicáveis das normas </w:t>
       </w:r>
+      <w:commentRangeStart w:id="6"/>
       <w:r>
         <w:rPr>
           <w:rFonts w:ascii="Cambria" w:hAnsi="Cambria"/>
@@ -386,6 +1811,16 @@
         </w:rPr>
         <w:t>(NORMAS DO SIG)</w:t>
       </w:r>
+      <w:commentRangeEnd w:id="6"/>
+      <w:r>
+        <w:rPr>
+          <w:rStyle w:val="Refdecomentrio"/>
+          <w:rFonts w:ascii="Cambria" w:hAnsi="Cambria"/>
+          <w:sz w:val="24"/>
+          <w:szCs w:val="24"/>
+        </w:rPr>
+        <w:commentReference w:id="6"/>
+      </w:r>
     </w:p>
     <w:p>
       <w:pPr>
@@ -402,8 +1837,8 @@
       </w:pPr>
     </w:p>
     <w:sectPr>
-      <w:headerReference w:type="default" r:id="rId7"/>
-      <w:footerReference w:type="default" r:id="rId8"/>
+      <w:headerReference w:type="default" r:id="rId11"/>
+      <w:footerReference w:type="default" r:id="rId12"/>
       <w:pgSz w:w="11906" w:h="16838"/>
       <w:pgMar w:top="1417" w:right="1701" w:bottom="1417" w:left="1701" w:header="708" w:footer="708" w:gutter="0"/>
       <w:cols w:space="708"/>
@@ -413,8 +1848,161 @@
 </w:document>
 </file>
 
+<file path=word/comments.xml><?xml version="1.0" encoding="utf-8"?>
+<w:comments xmlns:wpc="http://schemas.microsoft.com/office/word/2010/wordprocessingCanvas" xmlns:cx="http://schemas.microsoft.com/office/drawing/2014/chartex" xmlns:cx1="http://schemas.microsoft.com/office/drawing/2015/9/8/chartex" xmlns:cx2="http://schemas.microsoft.com/office/drawing/2015/10/21/chartex" xmlns:cx3="http://schemas.microsoft.com/office/drawing/2016/5/9/chartex" xmlns:cx4="http://schemas.microsoft.com/office/drawing/2016/5/10/chartex" xmlns:cx5="http://schemas.microsoft.com/office/drawing/2016/5/11/chartex" xmlns:cx6="http://schemas.microsoft.com/office/drawing/2016/5/12/chartex" xmlns:cx7="http://schemas.microsoft.com/office/drawing/2016/5/13/chartex" xmlns:cx8="http://schemas.microsoft.com/office/drawing/2016/5/14/chartex" xmlns:mc="http://schemas.openxmlformats.org/markup-compatibility/2006" xmlns:aink="http://schemas.microsoft.com/office/drawing/2016/ink" xmlns:am3d="http://schemas.microsoft.com/office/drawing/2017/model3d" xmlns:o="urn:schemas-microsoft-com:office:office" xmlns:oel="http://schemas.microsoft.com/office/2019/extlst" xmlns:r="http://schemas.openxmlformats.org/officeDocument/2006/relationships" xmlns:m="http://schemas.openxmlformats.org/officeDocument/2006/math" xmlns:v="urn:schemas-microsoft-com:vml" xmlns:wp14="http://schemas.microsoft.com/office/word/2010/wordprocessingDrawing" xmlns:wp="http://schemas.openxmlformats.org/drawingml/2006/wordprocessingDrawing" xmlns:w10="urn:schemas-microsoft-com:office:word" xmlns:w="http://schemas.openxmlformats.org/wordprocessingml/2006/main" xmlns:w14="http://schemas.microsoft.com/office/word/2010/wordml" xmlns:w15="http://schemas.microsoft.com/office/word/2012/wordml" xmlns:w16cei="http://schemas.microsoft.com/office/word/2026/wordml/cei" xmlns:w16cex="http://schemas.microsoft.com/office/word/2018/wordml/cex" xmlns:w16cid="http://schemas.microsoft.com/office/word/2016/wordml/cid" xmlns:w16="http://schemas.microsoft.com/office/word/2018/wordml" xmlns:w16du="http://schemas.microsoft.com/office/word/2023/wordml/word16du" xmlns:w16sdtdh="http://schemas.microsoft.com/office/word/2020/wordml/sdtdatahash" xmlns:w16sdtfl="http://schemas.microsoft.com/office/word/2024/wordml/sdtformatlock" xmlns:w16se="http://schemas.microsoft.com/office/word/2015/wordml/symex" xmlns:wpg="http://schemas.microsoft.com/office/word/2010/wordprocessingGroup" xmlns:wpi="http://schemas.microsoft.com/office/word/2010/wordprocessingInk" xmlns:wne="http://schemas.microsoft.com/office/word/2006/wordml" xmlns:wps="http://schemas.microsoft.com/office/word/2010/wordprocessingShape" mc:Ignorable="w14 w15 w16se w16cid w16 w16cex w16sdtdh w16sdtfl w16du wp14">
+  <w:comment w:id="0" w:author="THIFFANY GONÇALVES" w:date="2026-08-03T12:24:00Z" w:initials="TG">
+    <w:p>
+      <w:pPr>
+        <w:pStyle w:val="Textodecomentrio"/>
+      </w:pPr>
+      <w:r>
+        <w:rPr>
+          <w:rStyle w:val="Refdecomentrio"/>
+        </w:rPr>
+        <w:annotationRef/>
+      </w:r>
+      <w:r>
+        <w:t>Nome da Organização</w:t>
+      </w:r>
+    </w:p>
+  </w:comment>
+  <w:comment w:id="1" w:author="THIFFANY GONÇALVES" w:date="2026-08-03T12:24:00Z" w:initials="TG">
+    <w:p>
+      <w:pPr>
+        <w:pStyle w:val="Textodecomentrio"/>
+      </w:pPr>
+      <w:r>
+        <w:rPr>
+          <w:rStyle w:val="Refdecomentrio"/>
+        </w:rPr>
+        <w:annotationRef/>
+      </w:r>
+      <w:r>
+        <w:t>Ramo da Organização</w:t>
+      </w:r>
+    </w:p>
+  </w:comment>
+  <w:comment w:id="2" w:author="THIFFANY GONÇALVES" w:date="2026-08-03T12:24:00Z" w:initials="TG">
+    <w:p>
+      <w:pPr>
+        <w:pStyle w:val="Textodecomentrio"/>
+      </w:pPr>
+      <w:r>
+        <w:rPr>
+          <w:rStyle w:val="Refdecomentrio"/>
+        </w:rPr>
+        <w:annotationRef/>
+      </w:r>
+      <w:r>
+        <w:t xml:space="preserve">Morada da Organização </w:t>
+      </w:r>
+    </w:p>
+  </w:comment>
+  <w:comment w:id="3" w:author="THIFFANY GONÇALVES" w:date="2026-08-03T12:25:00Z" w:initials="TG">
+    <w:p>
+      <w:pPr>
+        <w:pStyle w:val="Textodecomentrio"/>
+      </w:pPr>
+      <w:r>
+        <w:rPr>
+          <w:rStyle w:val="Refdecomentrio"/>
+        </w:rPr>
+        <w:annotationRef/>
+      </w:r>
+      <w:r>
+        <w:t>Atividades da Organização</w:t>
+      </w:r>
+    </w:p>
+  </w:comment>
+  <w:comment w:id="4" w:author="THIFFANY GONÇALVES" w:date="2026-08-03T12:26:00Z" w:initials="TG">
+    <w:p>
+      <w:pPr>
+        <w:pStyle w:val="Textodecomentrio"/>
+      </w:pPr>
+      <w:r>
+        <w:rPr>
+          <w:rStyle w:val="Refdecomentrio"/>
+        </w:rPr>
+        <w:annotationRef/>
+      </w:r>
+      <w:r>
+        <w:t>Tudo que a organização faz em relação ao SIG</w:t>
+      </w:r>
+    </w:p>
+  </w:comment>
+  <w:comment w:id="5" w:author="THIFFANY GONÇALVES" w:date="2026-08-03T12:26:00Z" w:initials="TG">
+    <w:p>
+      <w:pPr>
+        <w:pStyle w:val="Textodecomentrio"/>
+      </w:pPr>
+      <w:r>
+        <w:rPr>
+          <w:rStyle w:val="Refdecomentrio"/>
+        </w:rPr>
+        <w:annotationRef/>
+      </w:r>
+      <w:r>
+        <w:t>Nome da Organização</w:t>
+      </w:r>
+    </w:p>
+  </w:comment>
+  <w:comment w:id="6" w:author="THIFFANY GONÇALVES" w:date="2026-08-03T12:26:00Z" w:initials="TG">
+    <w:p>
+      <w:pPr>
+        <w:pStyle w:val="Textodecomentrio"/>
+      </w:pPr>
+      <w:r>
+        <w:rPr>
+          <w:rStyle w:val="Refdecomentrio"/>
+        </w:rPr>
+        <w:annotationRef/>
+      </w:r>
+      <w:r>
+        <w:t>QUAIS SISTEMAS ESTÁ INTEGRANDO??</w:t>
+      </w:r>
+    </w:p>
+  </w:comment>
+</w:comments>
+</file>
+
+<file path=word/commentsExtended.xml><?xml version="1.0" encoding="utf-8"?>
+<w15:commentsEx xmlns:wpc="http://schemas.microsoft.com/office/word/2010/wordprocessingCanvas" xmlns:cx="http://schemas.microsoft.com/office/drawing/2014/chartex" xmlns:cx1="http://schemas.microsoft.com/office/drawing/2015/9/8/chartex" xmlns:cx2="http://schemas.microsoft.com/office/drawing/2015/10/21/chartex" xmlns:cx3="http://schemas.microsoft.com/office/drawing/2016/5/9/chartex" xmlns:cx4="http://schemas.microsoft.com/office/drawing/2016/5/10/chartex" xmlns:cx5="http://schemas.microsoft.com/office/drawing/2016/5/11/chartex" xmlns:cx6="http://schemas.microsoft.com/office/drawing/2016/5/12/chartex" xmlns:cx7="http://schemas.microsoft.com/office/drawing/2016/5/13/chartex" xmlns:cx8="http://schemas.microsoft.com/office/drawing/2016/5/14/chartex" xmlns:mc="http://schemas.openxmlformats.org/markup-compatibility/2006" xmlns:aink="http://schemas.microsoft.com/office/drawing/2016/ink" xmlns:am3d="http://schemas.microsoft.com/office/drawing/2017/model3d" xmlns:o="urn:schemas-microsoft-com:office:office" xmlns:oel="http://schemas.microsoft.com/office/2019/extlst" xmlns:r="http://schemas.openxmlformats.org/officeDocument/2006/relationships" xmlns:m="http://schemas.openxmlformats.org/officeDocument/2006/math" xmlns:v="urn:schemas-microsoft-com:vml" xmlns:wp14="http://schemas.microsoft.com/office/word/2010/wordprocessingDrawing" xmlns:wp="http://schemas.openxmlformats.org/drawingml/2006/wordprocessingDrawing" xmlns:w10="urn:schemas-microsoft-com:office:word" xmlns:w="http://schemas.openxmlformats.org/wordprocessingml/2006/main" xmlns:w14="http://schemas.microsoft.com/office/word/2010/wordml" xmlns:w15="http://schemas.microsoft.com/office/word/2012/wordml" xmlns:w16cei="http://schemas.microsoft.com/office/word/2026/wordml/cei" xmlns:w16cex="http://schemas.microsoft.com/office/word/2018/wordml/cex" xmlns:w16cid="http://schemas.microsoft.com/office/word/2016/wordml/cid" xmlns:w16="http://schemas.microsoft.com/office/word/2018/wordml" xmlns:w16du="http://schemas.microsoft.com/office/word/2023/wordml/word16du" xmlns:w16sdtdh="http://schemas.microsoft.com/office/word/2020/wordml/sdtdatahash" xmlns:w16sdtfl="http://schemas.microsoft.com/office/word/2024/wordml/sdtformatlock" xmlns:w16se="http://schemas.microsoft.com/office/word/2015/wordml/symex" xmlns:wpg="http://schemas.microsoft.com/office/word/2010/wordprocessingGroup" xmlns:wpi="http://schemas.microsoft.com/office/word/2010/wordprocessingInk" xmlns:wne="http://schemas.microsoft.com/office/word/2006/wordml" xmlns:wps="http://schemas.microsoft.com/office/word/2010/wordprocessingShape" mc:Ignorable="w14 w15 w16se w16cid w16 w16cex w16sdtdh w16sdtfl w16du wp14">
+  <w15:commentEx w15:paraId="6039315D" w15:done="0"/>
+  <w15:commentEx w15:paraId="22225EDC" w15:done="0"/>
+  <w15:commentEx w15:paraId="368E3513" w15:done="0"/>
+  <w15:commentEx w15:paraId="69DD67E6" w15:done="0"/>
+  <w15:commentEx w15:paraId="608202C7" w15:done="0"/>
+  <w15:commentEx w15:paraId="271EDC2C" w15:done="0"/>
+  <w15:commentEx w15:paraId="6F4DF478" w15:done="0"/>
+</w15:commentsEx>
+</file>
+
+<file path=word/commentsExtensible.xml><?xml version="1.0" encoding="utf-8"?>
+<w16cex:commentsExtensible xmlns:wpc="http://schemas.microsoft.com/office/word/2010/wordprocessingCanvas" xmlns:cx="http://schemas.microsoft.com/office/drawing/2014/chartex" xmlns:cx1="http://schemas.microsoft.com/office/drawing/2015/9/8/chartex" xmlns:cx2="http://schemas.microsoft.com/office/drawing/2015/10/21/chartex" xmlns:cx3="http://schemas.microsoft.com/office/drawing/2016/5/9/chartex" xmlns:cx4="http://schemas.microsoft.com/office/drawing/2016/5/10/chartex" xmlns:cx5="http://schemas.microsoft.com/office/drawing/2016/5/11/chartex" xmlns:cx6="http://schemas.microsoft.com/office/drawing/2016/5/12/chartex" xmlns:cx7="http://schemas.microsoft.com/office/drawing/2016/5/13/chartex" xmlns:cx8="http://schemas.microsoft.com/office/drawing/2016/5/14/chartex" xmlns:cr="http://schemas.microsoft.com/office/comments/2020/reactions" xmlns:mc="http://schemas.openxmlformats.org/markup-compatibility/2006" xmlns:aink="http://schemas.microsoft.com/office/drawing/2016/ink" xmlns:am3d="http://schemas.microsoft.com/office/drawing/2017/model3d" xmlns:o="urn:schemas-microsoft-com:office:office" xmlns:oel="http://schemas.microsoft.com/office/2019/extlst" xmlns:r="http://schemas.openxmlformats.org/officeDocument/2006/relationships" xmlns:m="http://schemas.openxmlformats.org/officeDocument/2006/math" xmlns:v="urn:schemas-microsoft-com:vml" xmlns:wp14="http://schemas.microsoft.com/office/word/2010/wordprocessingDrawing" xmlns:wp="http://schemas.openxmlformats.org/drawingml/2006/wordprocessingDrawing" xmlns:w10="urn:schemas-microsoft-com:office:word" xmlns:w="http://schemas.openxmlformats.org/wordprocessingml/2006/main" xmlns:w14="http://schemas.microsoft.com/office/word/2010/wordml" xmlns:w15="http://schemas.microsoft.com/office/word/2012/wordml" xmlns:w16cei="http://schemas.microsoft.com/office/word/2026/wordml/cei" xmlns:w16cex="http://schemas.microsoft.com/office/word/2018/wordml/cex" xmlns:w16cid="http://schemas.microsoft.com/office/word/2016/wordml/cid" xmlns:w16="http://schemas.microsoft.com/office/word/2018/wordml" xmlns:w16du="http://schemas.microsoft.com/office/word/2023/wordml/word16du" xmlns:w16sdtdh="http://schemas.microsoft.com/office/word/2020/wordml/sdtdatahash" xmlns:w16sdtfl="http://schemas.microsoft.com/office/word/2024/wordml/sdtformatlock" xmlns:w16se="http://schemas.microsoft.com/office/word/2015/wordml/symex" xmlns:wpg="http://schemas.microsoft.com/office/word/2010/wordprocessingGroup" xmlns:wpi="http://schemas.microsoft.com/office/word/2010/wordprocessingInk" xmlns:wne="http://schemas.microsoft.com/office/word/2006/wordml" xmlns:wps="http://schemas.microsoft.com/office/word/2010/wordprocessingShape" mc:Ignorable="w14 w15 w16se w16cid w16 w16cex w16sdtdh w16sdtfl cr w16du wp14">
+  <w16cex:commentExtensible w16cex:durableId="409868A2" w16cex:dateUtc="2026-08-03T11:24:00Z"/>
+  <w16cex:commentExtensible w16cex:durableId="19214222" w16cex:dateUtc="2026-08-03T11:24:00Z"/>
+  <w16cex:commentExtensible w16cex:durableId="28F4A743" w16cex:dateUtc="2026-08-03T11:24:00Z"/>
+  <w16cex:commentExtensible w16cex:durableId="25DFF6E8" w16cex:dateUtc="2026-08-03T11:25:00Z"/>
+  <w16cex:commentExtensible w16cex:durableId="4BEB4C92" w16cex:dateUtc="2026-08-03T11:26:00Z"/>
+  <w16cex:commentExtensible w16cex:durableId="56D219B6" w16cex:dateUtc="2026-08-03T11:26:00Z"/>
+  <w16cex:commentExtensible w16cex:durableId="5FE18B2A" w16cex:dateUtc="2026-08-03T11:26:00Z"/>
+</w16cex:commentsExtensible>
+</file>
+
+<file path=word/commentsIds.xml><?xml version="1.0" encoding="utf-8"?>
+<w16cid:commentsIds xmlns:wpc="http://schemas.microsoft.com/office/word/2010/wordprocessingCanvas" xmlns:cx="http://schemas.microsoft.com/office/drawing/2014/chartex" xmlns:cx1="http://schemas.microsoft.com/office/drawing/2015/9/8/chartex" xmlns:cx2="http://schemas.microsoft.com/office/drawing/2015/10/21/chartex" xmlns:cx3="http://schemas.microsoft.com/office/drawing/2016/5/9/chartex" xmlns:cx4="http://schemas.microsoft.com/office/drawing/2016/5/10/chartex" xmlns:cx5="http://schemas.microsoft.com/office/drawing/2016/5/11/chartex" xmlns:cx6="http://schemas.microsoft.com/office/drawing/2016/5/12/chartex" xmlns:cx7="http://schemas.microsoft.com/office/drawing/2016/5/13/chartex" xmlns:cx8="http://schemas.microsoft.com/office/drawing/2016/5/14/chartex" xmlns:mc="http://schemas.openxmlformats.org/markup-compatibility/2006" xmlns:aink="http://schemas.microsoft.com/office/drawing/2016/ink" xmlns:am3d="http://schemas.microsoft.com/office/drawing/2017/model3d" xmlns:o="urn:schemas-microsoft-com:office:office" xmlns:oel="http://schemas.microsoft.com/office/2019/extlst" xmlns:r="http://schemas.openxmlformats.org/officeDocument/2006/relationships" xmlns:m="http://schemas.openxmlformats.org/officeDocument/2006/math" xmlns:v="urn:schemas-microsoft-com:vml" xmlns:wp14="http://schemas.microsoft.com/office/word/2010/wordprocessingDrawing" xmlns:wp="http://schemas.openxmlformats.org/drawingml/2006/wordprocessingDrawing" xmlns:w10="urn:schemas-microsoft-com:office:word" xmlns:w="http://schemas.openxmlformats.org/wordprocessingml/2006/main" xmlns:w14="http://schemas.microsoft.com/office/word/2010/wordml" xmlns:w15="http://schemas.microsoft.com/office/word/2012/wordml" xmlns:w16cei="http://schemas.microsoft.com/office/word/2026/wordml/cei" xmlns:w16cex="http://schemas.microsoft.com/office/word/2018/wordml/cex" xmlns:w16cid="http://schemas.microsoft.com/office/word/2016/wordml/cid" xmlns:w16="http://schemas.microsoft.com/office/word/2018/wordml" xmlns:w16du="http://schemas.microsoft.com/office/word/2023/wordml/word16du" xmlns:w16sdtdh="http://schemas.microsoft.com/office/word/2020/wordml/sdtdatahash" xmlns:w16sdtfl="http://schemas.microsoft.com/office/word/2024/wordml/sdtformatlock" xmlns:w16se="http://schemas.microsoft.com/office/word/2015/wordml/symex" xmlns:wpg="http://schemas.microsoft.com/office/word/2010/wordprocessingGroup" xmlns:wpi="http://schemas.microsoft.com/office/word/2010/wordprocessingInk" xmlns:wne="http://schemas.microsoft.com/office/word/2006/wordml" xmlns:wps="http://schemas.microsoft.com/office/word/2010/wordprocessingShape" mc:Ignorable="w14 w15 w16se w16cid w16 w16cex w16sdtdh w16sdtfl w16du wp14">
+  <w16cid:commentId w16cid:paraId="6039315D" w16cid:durableId="409868A2"/>
+  <w16cid:commentId w16cid:paraId="22225EDC" w16cid:durableId="19214222"/>
+  <w16cid:commentId w16cid:paraId="368E3513" w16cid:durableId="28F4A743"/>
+  <w16cid:commentId w16cid:paraId="69DD67E6" w16cid:durableId="25DFF6E8"/>
+  <w16cid:commentId w16cid:paraId="608202C7" w16cid:durableId="4BEB4C92"/>
+  <w16cid:commentId w16cid:paraId="271EDC2C" w16cid:durableId="56D219B6"/>
+  <w16cid:commentId w16cid:paraId="6F4DF478" w16cid:durableId="5FE18B2A"/>
+</w16cid:commentsIds>
+</file>
+
 <file path=word/endnotes.xml><?xml version="1.0" encoding="utf-8"?>
-<w:endnotes xmlns:wpc="http://schemas.microsoft.com/office/word/2010/wordprocessingCanvas" xmlns:cx="http://schemas.microsoft.com/office/drawing/2014/chartex" xmlns:cx1="http://schemas.microsoft.com/office/drawing/2015/9/8/chartex" xmlns:cx2="http://schemas.microsoft.com/office/drawing/2015/10/21/chartex" xmlns:cx3="http://schemas.microsoft.com/office/drawing/2016/5/9/chartex" xmlns:cx4="http://schemas.microsoft.com/office/drawing/2016/5/10/chartex" xmlns:cx5="http://schemas.microsoft.com/office/drawing/2016/5/11/chartex" xmlns:cx6="http://schemas.microsoft.com/office/drawing/2016/5/12/chartex" xmlns:cx7="http://schemas.microsoft.com/office/drawing/2016/5/13/chartex" xmlns:cx8="http://schemas.microsoft.com/office/drawing/2016/5/14/chartex" xmlns:mc="http://schemas.openxmlformats.org/markup-compatibility/2006" xmlns:aink="http://schemas.microsoft.com/office/drawing/2016/ink" xmlns:am3d="http://schemas.microsoft.com/office/drawing/2017/model3d" xmlns:o="urn:schemas-microsoft-com:office:office" xmlns:oel="http://schemas.microsoft.com/office/2019/extlst" xmlns:r="http://schemas.openxmlformats.org/officeDocument/2006/relationships" xmlns:m="http://schemas.openxmlformats.org/officeDocument/2006/math" xmlns:v="urn:schemas-microsoft-com:vml" xmlns:wp14="http://schemas.microsoft.com/office/word/2010/wordprocessingDrawing" xmlns:wp="http://schemas.openxmlformats.org/drawingml/2006/wordprocessingDrawing" xmlns:w10="urn:schemas-microsoft-com:office:word" xmlns:w="http://schemas.openxmlformats.org/wordprocessingml/2006/main" xmlns:w14="http://schemas.microsoft.com/office/word/2010/wordml" xmlns:w15="http://schemas.microsoft.com/office/word/2012/wordml" xmlns:w16cex="http://schemas.microsoft.com/office/word/2018/wordml/cex" xmlns:w16cid="http://schemas.microsoft.com/office/word/2016/wordml/cid" xmlns:w16="http://schemas.microsoft.com/office/word/2018/wordml" xmlns:w16du="http://schemas.microsoft.com/office/word/2023/wordml/word16du" xmlns:w16sdtdh="http://schemas.microsoft.com/office/word/2020/wordml/sdtdatahash" xmlns:w16sdtfl="http://schemas.microsoft.com/office/word/2024/wordml/sdtformatlock" xmlns:w16se="http://schemas.microsoft.com/office/word/2015/wordml/symex" xmlns:wpg="http://schemas.microsoft.com/office/word/2010/wordprocessingGroup" xmlns:wpi="http://schemas.microsoft.com/office/word/2010/wordprocessingInk" xmlns:wne="http://schemas.microsoft.com/office/word/2006/wordml" xmlns:wps="http://schemas.microsoft.com/office/word/2010/wordprocessingShape" mc:Ignorable="w14 w15 w16se w16cid w16 w16cex w16sdtdh w16sdtfl w16du wp14">
+<w:endnotes xmlns:wpc="http://schemas.microsoft.com/office/word/2010/wordprocessingCanvas" xmlns:cx="http://schemas.microsoft.com/office/drawing/2014/chartex" xmlns:cx1="http://schemas.microsoft.com/office/drawing/2015/9/8/chartex" xmlns:cx2="http://schemas.microsoft.com/office/drawing/2015/10/21/chartex" xmlns:cx3="http://schemas.microsoft.com/office/drawing/2016/5/9/chartex" xmlns:cx4="http://schemas.microsoft.com/office/drawing/2016/5/10/chartex" xmlns:cx5="http://schemas.microsoft.com/office/drawing/2016/5/11/chartex" xmlns:cx6="http://schemas.microsoft.com/office/drawing/2016/5/12/chartex" xmlns:cx7="http://schemas.microsoft.com/office/drawing/2016/5/13/chartex" xmlns:cx8="http://schemas.microsoft.com/office/drawing/2016/5/14/chartex" xmlns:mc="http://schemas.openxmlformats.org/markup-compatibility/2006" xmlns:aink="http://schemas.microsoft.com/office/drawing/2016/ink" xmlns:am3d="http://schemas.microsoft.com/office/drawing/2017/model3d" xmlns:o="urn:schemas-microsoft-com:office:office" xmlns:oel="http://schemas.microsoft.com/office/2019/extlst" xmlns:r="http://schemas.openxmlformats.org/officeDocument/2006/relationships" xmlns:m="http://schemas.openxmlformats.org/officeDocument/2006/math" xmlns:v="urn:schemas-microsoft-com:vml" xmlns:wp14="http://schemas.microsoft.com/office/word/2010/wordprocessingDrawing" xmlns:wp="http://schemas.openxmlformats.org/drawingml/2006/wordprocessingDrawing" xmlns:w10="urn:schemas-microsoft-com:office:word" xmlns:w="http://schemas.openxmlformats.org/wordprocessingml/2006/main" xmlns:w14="http://schemas.microsoft.com/office/word/2010/wordml" xmlns:w15="http://schemas.microsoft.com/office/word/2012/wordml" xmlns:w16cei="http://schemas.microsoft.com/office/word/2026/wordml/cei" xmlns:w16cex="http://schemas.microsoft.com/office/word/2018/wordml/cex" xmlns:w16cid="http://schemas.microsoft.com/office/word/2016/wordml/cid" xmlns:w16="http://schemas.microsoft.com/office/word/2018/wordml" xmlns:w16du="http://schemas.microsoft.com/office/word/2023/wordml/word16du" xmlns:w16sdtdh="http://schemas.microsoft.com/office/word/2020/wordml/sdtdatahash" xmlns:w16sdtfl="http://schemas.microsoft.com/office/word/2024/wordml/sdtformatlock" xmlns:w16se="http://schemas.microsoft.com/office/word/2015/wordml/symex" xmlns:wpg="http://schemas.microsoft.com/office/word/2010/wordprocessingGroup" xmlns:wpi="http://schemas.microsoft.com/office/word/2010/wordprocessingInk" xmlns:wne="http://schemas.microsoft.com/office/word/2006/wordml" xmlns:wps="http://schemas.microsoft.com/office/word/2010/wordprocessingShape" mc:Ignorable="w14 w15 w16se w16cid w16 w16cex w16sdtdh w16sdtfl w16du wp14">
   <w:endnote w:type="separator" w:id="-1">
     <w:p>
       <w:pPr>
@@ -439,7 +2027,7 @@
 </file>
 
 <file path=word/footer1.xml><?xml version="1.0" encoding="utf-8"?>
-<w:ftr xmlns:wpc="http://schemas.microsoft.com/office/word/2010/wordprocessingCanvas" xmlns:cx="http://schemas.microsoft.com/office/drawing/2014/chartex" xmlns:cx1="http://schemas.microsoft.com/office/drawing/2015/9/8/chartex" xmlns:cx2="http://schemas.microsoft.com/office/drawing/2015/10/21/chartex" xmlns:cx3="http://schemas.microsoft.com/office/drawing/2016/5/9/chartex" xmlns:cx4="http://schemas.microsoft.com/office/drawing/2016/5/10/chartex" xmlns:cx5="http://schemas.microsoft.com/office/drawing/2016/5/11/chartex" xmlns:cx6="http://schemas.microsoft.com/office/drawing/2016/5/12/chartex" xmlns:cx7="http://schemas.microsoft.com/office/drawing/2016/5/13/chartex" xmlns:cx8="http://schemas.microsoft.com/office/drawing/2016/5/14/chartex" xmlns:mc="http://schemas.openxmlformats.org/markup-compatibility/2006" xmlns:aink="http://schemas.microsoft.com/office/drawing/2016/ink" xmlns:am3d="http://schemas.microsoft.com/office/drawing/2017/model3d" xmlns:o="urn:schemas-microsoft-com:office:office" xmlns:oel="http://schemas.microsoft.com/office/2019/extlst" xmlns:r="http://schemas.openxmlformats.org/officeDocument/2006/relationships" xmlns:m="http://schemas.openxmlformats.org/officeDocument/2006/math" xmlns:v="urn:schemas-microsoft-com:vml" xmlns:wp14="http://schemas.microsoft.com/office/word/2010/wordprocessingDrawing" xmlns:wp="http://schemas.openxmlformats.org/drawingml/2006/wordprocessingDrawing" xmlns:w10="urn:schemas-microsoft-com:office:word" xmlns:w="http://schemas.openxmlformats.org/wordprocessingml/2006/main" xmlns:w14="http://schemas.microsoft.com/office/word/2010/wordml" xmlns:w15="http://schemas.microsoft.com/office/word/2012/wordml" xmlns:w16cex="http://schemas.microsoft.com/office/word/2018/wordml/cex" xmlns:w16cid="http://schemas.microsoft.com/office/word/2016/wordml/cid" xmlns:w16="http://schemas.microsoft.com/office/word/2018/wordml" xmlns:w16du="http://schemas.microsoft.com/office/word/2023/wordml/word16du" xmlns:w16sdtdh="http://schemas.microsoft.com/office/word/2020/wordml/sdtdatahash" xmlns:w16sdtfl="http://schemas.microsoft.com/office/word/2024/wordml/sdtformatlock" xmlns:w16se="http://schemas.microsoft.com/office/word/2015/wordml/symex" xmlns:wpg="http://schemas.microsoft.com/office/word/2010/wordprocessingGroup" xmlns:wpi="http://schemas.microsoft.com/office/word/2010/wordprocessingInk" xmlns:wne="http://schemas.microsoft.com/office/word/2006/wordml" xmlns:wps="http://schemas.microsoft.com/office/word/2010/wordprocessingShape" mc:Ignorable="w14 w15 w16se w16cid w16 w16cex w16sdtdh w16sdtfl w16du wp14">
+<w:ftr xmlns:wpc="http://schemas.microsoft.com/office/word/2010/wordprocessingCanvas" xmlns:cx="http://schemas.microsoft.com/office/drawing/2014/chartex" xmlns:cx1="http://schemas.microsoft.com/office/drawing/2015/9/8/chartex" xmlns:cx2="http://schemas.microsoft.com/office/drawing/2015/10/21/chartex" xmlns:cx3="http://schemas.microsoft.com/office/drawing/2016/5/9/chartex" xmlns:cx4="http://schemas.microsoft.com/office/drawing/2016/5/10/chartex" xmlns:cx5="http://schemas.microsoft.com/office/drawing/2016/5/11/chartex" xmlns:cx6="http://schemas.microsoft.com/office/drawing/2016/5/12/chartex" xmlns:cx7="http://schemas.microsoft.com/office/drawing/2016/5/13/chartex" xmlns:cx8="http://schemas.microsoft.com/office/drawing/2016/5/14/chartex" xmlns:mc="http://schemas.openxmlformats.org/markup-compatibility/2006" xmlns:aink="http://schemas.microsoft.com/office/drawing/2016/ink" xmlns:am3d="http://schemas.microsoft.com/office/drawing/2017/model3d" xmlns:o="urn:schemas-microsoft-com:office:office" xmlns:oel="http://schemas.microsoft.com/office/2019/extlst" xmlns:r="http://schemas.openxmlformats.org/officeDocument/2006/relationships" xmlns:m="http://schemas.openxmlformats.org/officeDocument/2006/math" xmlns:v="urn:schemas-microsoft-com:vml" xmlns:wp14="http://schemas.microsoft.com/office/word/2010/wordprocessingDrawing" xmlns:wp="http://schemas.openxmlformats.org/drawingml/2006/wordprocessingDrawing" xmlns:w10="urn:schemas-microsoft-com:office:word" xmlns:w="http://schemas.openxmlformats.org/wordprocessingml/2006/main" xmlns:w14="http://schemas.microsoft.com/office/word/2010/wordml" xmlns:w15="http://schemas.microsoft.com/office/word/2012/wordml" xmlns:w16cei="http://schemas.microsoft.com/office/word/2026/wordml/cei" xmlns:w16cex="http://schemas.microsoft.com/office/word/2018/wordml/cex" xmlns:w16cid="http://schemas.microsoft.com/office/word/2016/wordml/cid" xmlns:w16="http://schemas.microsoft.com/office/word/2018/wordml" xmlns:w16du="http://schemas.microsoft.com/office/word/2023/wordml/word16du" xmlns:w16sdtdh="http://schemas.microsoft.com/office/word/2020/wordml/sdtdatahash" xmlns:w16sdtfl="http://schemas.microsoft.com/office/word/2024/wordml/sdtformatlock" xmlns:w16se="http://schemas.microsoft.com/office/word/2015/wordml/symex" xmlns:wpg="http://schemas.microsoft.com/office/word/2010/wordprocessingGroup" xmlns:wpi="http://schemas.microsoft.com/office/word/2010/wordprocessingInk" xmlns:wne="http://schemas.microsoft.com/office/word/2006/wordml" xmlns:wps="http://schemas.microsoft.com/office/word/2010/wordprocessingShape" mc:Ignorable="w14 w15 w16se w16cid w16 w16cex w16sdtdh w16sdtfl w16du wp14">
   <w:p>
     <w:pPr>
       <w:pStyle w:val="Rodap"/>
@@ -602,7 +2190,7 @@
 </file>
 
 <file path=word/footnotes.xml><?xml version="1.0" encoding="utf-8"?>
-<w:footnotes xmlns:wpc="http://schemas.microsoft.com/office/word/2010/wordprocessingCanvas" xmlns:cx="http://schemas.microsoft.com/office/drawing/2014/chartex" xmlns:cx1="http://schemas.microsoft.com/office/drawing/2015/9/8/chartex" xmlns:cx2="http://schemas.microsoft.com/office/drawing/2015/10/21/chartex" xmlns:cx3="http://schemas.microsoft.com/office/drawing/2016/5/9/chartex" xmlns:cx4="http://schemas.microsoft.com/office/drawing/2016/5/10/chartex" xmlns:cx5="http://schemas.microsoft.com/office/drawing/2016/5/11/chartex" xmlns:cx6="http://schemas.microsoft.com/office/drawing/2016/5/12/chartex" xmlns:cx7="http://schemas.microsoft.com/office/drawing/2016/5/13/chartex" xmlns:cx8="http://schemas.microsoft.com/office/drawing/2016/5/14/chartex" xmlns:mc="http://schemas.openxmlformats.org/markup-compatibility/2006" xmlns:aink="http://schemas.microsoft.com/office/drawing/2016/ink" xmlns:am3d="http://schemas.microsoft.com/office/drawing/2017/model3d" xmlns:o="urn:schemas-microsoft-com:office:office" xmlns:oel="http://schemas.microsoft.com/office/2019/extlst" xmlns:r="http://schemas.openxmlformats.org/officeDocument/2006/relationships" xmlns:m="http://schemas.openxmlformats.org/officeDocument/2006/math" xmlns:v="urn:schemas-microsoft-com:vml" xmlns:wp14="http://schemas.microsoft.com/office/word/2010/wordprocessingDrawing" xmlns:wp="http://schemas.openxmlformats.org/drawingml/2006/wordprocessingDrawing" xmlns:w10="urn:schemas-microsoft-com:office:word" xmlns:w="http://schemas.openxmlformats.org/wordprocessingml/2006/main" xmlns:w14="http://schemas.microsoft.com/office/word/2010/wordml" xmlns:w15="http://schemas.microsoft.com/office/word/2012/wordml" xmlns:w16cex="http://schemas.microsoft.com/office/word/2018/wordml/cex" xmlns:w16cid="http://schemas.microsoft.com/office/word/2016/wordml/cid" xmlns:w16="http://schemas.microsoft.com/office/word/2018/wordml" xmlns:w16du="http://schemas.microsoft.com/office/word/2023/wordml/word16du" xmlns:w16sdtdh="http://schemas.microsoft.com/office/word/2020/wordml/sdtdatahash" xmlns:w16sdtfl="http://schemas.microsoft.com/office/word/2024/wordml/sdtformatlock" xmlns:w16se="http://schemas.microsoft.com/office/word/2015/wordml/symex" xmlns:wpg="http://schemas.microsoft.com/office/word/2010/wordprocessingGroup" xmlns:wpi="http://schemas.microsoft.com/office/word/2010/wordprocessingInk" xmlns:wne="http://schemas.microsoft.com/office/word/2006/wordml" xmlns:wps="http://schemas.microsoft.com/office/word/2010/wordprocessingShape" mc:Ignorable="w14 w15 w16se w16cid w16 w16cex w16sdtdh w16sdtfl w16du wp14">
+<w:footnotes xmlns:wpc="http://schemas.microsoft.com/office/word/2010/wordprocessingCanvas" xmlns:cx="http://schemas.microsoft.com/office/drawing/2014/chartex" xmlns:cx1="http://schemas.microsoft.com/office/drawing/2015/9/8/chartex" xmlns:cx2="http://schemas.microsoft.com/office/drawing/2015/10/21/chartex" xmlns:cx3="http://schemas.microsoft.com/office/drawing/2016/5/9/chartex" xmlns:cx4="http://schemas.microsoft.com/office/drawing/2016/5/10/chartex" xmlns:cx5="http://schemas.microsoft.com/office/drawing/2016/5/11/chartex" xmlns:cx6="http://schemas.microsoft.com/office/drawing/2016/5/12/chartex" xmlns:cx7="http://schemas.microsoft.com/office/drawing/2016/5/13/chartex" xmlns:cx8="http://schemas.microsoft.com/office/drawing/2016/5/14/chartex" xmlns:mc="http://schemas.openxmlformats.org/markup-compatibility/2006" xmlns:aink="http://schemas.microsoft.com/office/drawing/2016/ink" xmlns:am3d="http://schemas.microsoft.com/office/drawing/2017/model3d" xmlns:o="urn:schemas-microsoft-com:office:office" xmlns:oel="http://schemas.microsoft.com/office/2019/extlst" xmlns:r="http://schemas.openxmlformats.org/officeDocument/2006/relationships" xmlns:m="http://schemas.openxmlformats.org/officeDocument/2006/math" xmlns:v="urn:schemas-microsoft-com:vml" xmlns:wp14="http://schemas.microsoft.com/office/word/2010/wordprocessingDrawing" xmlns:wp="http://schemas.openxmlformats.org/drawingml/2006/wordprocessingDrawing" xmlns:w10="urn:schemas-microsoft-com:office:word" xmlns:w="http://schemas.openxmlformats.org/wordprocessingml/2006/main" xmlns:w14="http://schemas.microsoft.com/office/word/2010/wordml" xmlns:w15="http://schemas.microsoft.com/office/word/2012/wordml" xmlns:w16cei="http://schemas.microsoft.com/office/word/2026/wordml/cei" xmlns:w16cex="http://schemas.microsoft.com/office/word/2018/wordml/cex" xmlns:w16cid="http://schemas.microsoft.com/office/word/2016/wordml/cid" xmlns:w16="http://schemas.microsoft.com/office/word/2018/wordml" xmlns:w16du="http://schemas.microsoft.com/office/word/2023/wordml/word16du" xmlns:w16sdtdh="http://schemas.microsoft.com/office/word/2020/wordml/sdtdatahash" xmlns:w16sdtfl="http://schemas.microsoft.com/office/word/2024/wordml/sdtformatlock" xmlns:w16se="http://schemas.microsoft.com/office/word/2015/wordml/symex" xmlns:wpg="http://schemas.microsoft.com/office/word/2010/wordprocessingGroup" xmlns:wpi="http://schemas.microsoft.com/office/word/2010/wordprocessingInk" xmlns:wne="http://schemas.microsoft.com/office/word/2006/wordml" xmlns:wps="http://schemas.microsoft.com/office/word/2010/wordprocessingShape" mc:Ignorable="w14 w15 w16se w16cid w16 w16cex w16sdtdh w16sdtfl w16du wp14">
   <w:footnote w:type="separator" w:id="-1">
     <w:p>
       <w:pPr>
@@ -627,7 +2215,7 @@
 </file>
 
 <file path=word/header1.xml><?xml version="1.0" encoding="utf-8"?>
-<w:hdr xmlns:wpc="http://schemas.microsoft.com/office/word/2010/wordprocessingCanvas" xmlns:cx="http://schemas.microsoft.com/office/drawing/2014/chartex" xmlns:cx1="http://schemas.microsoft.com/office/drawing/2015/9/8/chartex" xmlns:cx2="http://schemas.microsoft.com/office/drawing/2015/10/21/chartex" xmlns:cx3="http://schemas.microsoft.com/office/drawing/2016/5/9/chartex" xmlns:cx4="http://schemas.microsoft.com/office/drawing/2016/5/10/chartex" xmlns:cx5="http://schemas.microsoft.com/office/drawing/2016/5/11/chartex" xmlns:cx6="http://schemas.microsoft.com/office/drawing/2016/5/12/chartex" xmlns:cx7="http://schemas.microsoft.com/office/drawing/2016/5/13/chartex" xmlns:cx8="http://schemas.microsoft.com/office/drawing/2016/5/14/chartex" xmlns:mc="http://schemas.openxmlformats.org/markup-compatibility/2006" xmlns:aink="http://schemas.microsoft.com/office/drawing/2016/ink" xmlns:am3d="http://schemas.microsoft.com/office/drawing/2017/model3d" xmlns:o="urn:schemas-microsoft-com:office:office" xmlns:oel="http://schemas.microsoft.com/office/2019/extlst" xmlns:r="http://schemas.openxmlformats.org/officeDocument/2006/relationships" xmlns:m="http://schemas.openxmlformats.org/officeDocument/2006/math" xmlns:v="urn:schemas-microsoft-com:vml" xmlns:wp14="http://schemas.microsoft.com/office/word/2010/wordprocessingDrawing" xmlns:wp="http://schemas.openxmlformats.org/drawingml/2006/wordprocessingDrawing" xmlns:w10="urn:schemas-microsoft-com:office:word" xmlns:w="http://schemas.openxmlformats.org/wordprocessingml/2006/main" xmlns:w14="http://schemas.microsoft.com/office/word/2010/wordml" xmlns:w15="http://schemas.microsoft.com/office/word/2012/wordml" xmlns:w16cex="http://schemas.microsoft.com/office/word/2018/wordml/cex" xmlns:w16cid="http://schemas.microsoft.com/office/word/2016/wordml/cid" xmlns:w16="http://schemas.microsoft.com/office/word/2018/wordml" xmlns:w16du="http://schemas.microsoft.com/office/word/2023/wordml/word16du" xmlns:w16sdtdh="http://schemas.microsoft.com/office/word/2020/wordml/sdtdatahash" xmlns:w16sdtfl="http://schemas.microsoft.com/office/word/2024/wordml/sdtformatlock" xmlns:w16se="http://schemas.microsoft.com/office/word/2015/wordml/symex" xmlns:wpg="http://schemas.microsoft.com/office/word/2010/wordprocessingGroup" xmlns:wpi="http://schemas.microsoft.com/office/word/2010/wordprocessingInk" xmlns:wne="http://schemas.microsoft.com/office/word/2006/wordml" xmlns:wps="http://schemas.microsoft.com/office/word/2010/wordprocessingShape" mc:Ignorable="w14 w15 w16se w16cid w16 w16cex w16sdtdh w16sdtfl w16du wp14">
+<w:hdr xmlns:wpc="http://schemas.microsoft.com/office/word/2010/wordprocessingCanvas" xmlns:cx="http://schemas.microsoft.com/office/drawing/2014/chartex" xmlns:cx1="http://schemas.microsoft.com/office/drawing/2015/9/8/chartex" xmlns:cx2="http://schemas.microsoft.com/office/drawing/2015/10/21/chartex" xmlns:cx3="http://schemas.microsoft.com/office/drawing/2016/5/9/chartex" xmlns:cx4="http://schemas.microsoft.com/office/drawing/2016/5/10/chartex" xmlns:cx5="http://schemas.microsoft.com/office/drawing/2016/5/11/chartex" xmlns:cx6="http://schemas.microsoft.com/office/drawing/2016/5/12/chartex" xmlns:cx7="http://schemas.microsoft.com/office/drawing/2016/5/13/chartex" xmlns:cx8="http://schemas.microsoft.com/office/drawing/2016/5/14/chartex" xmlns:mc="http://schemas.openxmlformats.org/markup-compatibility/2006" xmlns:aink="http://schemas.microsoft.com/office/drawing/2016/ink" xmlns:am3d="http://schemas.microsoft.com/office/drawing/2017/model3d" xmlns:o="urn:schemas-microsoft-com:office:office" xmlns:oel="http://schemas.microsoft.com/office/2019/extlst" xmlns:r="http://schemas.openxmlformats.org/officeDocument/2006/relationships" xmlns:m="http://schemas.openxmlformats.org/officeDocument/2006/math" xmlns:v="urn:schemas-microsoft-com:vml" xmlns:wp14="http://schemas.microsoft.com/office/word/2010/wordprocessingDrawing" xmlns:wp="http://schemas.openxmlformats.org/drawingml/2006/wordprocessingDrawing" xmlns:w10="urn:schemas-microsoft-com:office:word" xmlns:w="http://schemas.openxmlformats.org/wordprocessingml/2006/main" xmlns:w14="http://schemas.microsoft.com/office/word/2010/wordml" xmlns:w15="http://schemas.microsoft.com/office/word/2012/wordml" xmlns:w16cei="http://schemas.microsoft.com/office/word/2026/wordml/cei" xmlns:w16cex="http://schemas.microsoft.com/office/word/2018/wordml/cex" xmlns:w16cid="http://schemas.microsoft.com/office/word/2016/wordml/cid" xmlns:w16="http://schemas.microsoft.com/office/word/2018/wordml" xmlns:w16du="http://schemas.microsoft.com/office/word/2023/wordml/word16du" xmlns:w16sdtdh="http://schemas.microsoft.com/office/word/2020/wordml/sdtdatahash" xmlns:w16sdtfl="http://schemas.microsoft.com/office/word/2024/wordml/sdtformatlock" xmlns:w16se="http://schemas.microsoft.com/office/word/2015/wordml/symex" xmlns:wpg="http://schemas.microsoft.com/office/word/2010/wordprocessingGroup" xmlns:wpi="http://schemas.microsoft.com/office/word/2010/wordprocessingInk" xmlns:wne="http://schemas.microsoft.com/office/word/2006/wordml" xmlns:wps="http://schemas.microsoft.com/office/word/2010/wordprocessingShape" mc:Ignorable="w14 w15 w16se w16cid w16 w16cex w16sdtdh w16sdtfl w16du wp14">
   <w:p>
     <w:pPr>
       <w:pStyle w:val="Cabealho"/>
@@ -729,11 +2317,11 @@
 </file>
 
 <file path=word/numbering.xml><?xml version="1.0" encoding="utf-8"?>
-<w:numbering xmlns:wpc="http://schemas.microsoft.com/office/word/2010/wordprocessingCanvas" xmlns:cx="http://schemas.microsoft.com/office/drawing/2014/chartex" xmlns:cx1="http://schemas.microsoft.com/office/drawing/2015/9/8/chartex" xmlns:cx2="http://schemas.microsoft.com/office/drawing/2015/10/21/chartex" xmlns:cx3="http://schemas.microsoft.com/office/drawing/2016/5/9/chartex" xmlns:cx4="http://schemas.microsoft.com/office/drawing/2016/5/10/chartex" xmlns:cx5="http://schemas.microsoft.com/office/drawing/2016/5/11/chartex" xmlns:cx6="http://schemas.microsoft.com/office/drawing/2016/5/12/chartex" xmlns:cx7="http://schemas.microsoft.com/office/drawing/2016/5/13/chartex" xmlns:cx8="http://schemas.microsoft.com/office/drawing/2016/5/14/chartex" xmlns:mc="http://schemas.openxmlformats.org/markup-compatibility/2006" xmlns:aink="http://schemas.microsoft.com/office/drawing/2016/ink" xmlns:am3d="http://schemas.microsoft.com/office/drawing/2017/model3d" xmlns:o="urn:schemas-microsoft-com:office:office" xmlns:oel="http://schemas.microsoft.com/office/2019/extlst" xmlns:r="http://schemas.openxmlformats.org/officeDocument/2006/relationships" xmlns:m="http://schemas.openxmlformats.org/officeDocument/2006/math" xmlns:v="urn:schemas-microsoft-com:vml" xmlns:wp14="http://schemas.microsoft.com/office/word/2010/wordprocessingDrawing" xmlns:wp="http://schemas.openxmlformats.org/drawingml/2006/wordprocessingDrawing" xmlns:w10="urn:schemas-microsoft-com:office:word" xmlns:w="http://schemas.openxmlformats.org/wordprocessingml/2006/main" xmlns:w14="http://schemas.microsoft.com/office/word/2010/wordml" xmlns:w15="http://schemas.microsoft.com/office/word/2012/wordml" xmlns:w16cex="http://schemas.microsoft.com/office/word/2018/wordml/cex" xmlns:w16cid="http://schemas.microsoft.com/office/word/2016/wordml/cid" xmlns:w16="http://schemas.microsoft.com/office/word/2018/wordml" xmlns:w16du="http://schemas.microsoft.com/office/word/2023/wordml/word16du" xmlns:w16sdtdh="http://schemas.microsoft.com/office/word/2020/wordml/sdtdatahash" xmlns:w16sdtfl="http://schemas.microsoft.com/office/word/2024/wordml/sdtformatlock" xmlns:w16se="http://schemas.microsoft.com/office/word/2015/wordml/symex" xmlns:wpg="http://schemas.microsoft.com/office/word/2010/wordprocessingGroup" xmlns:wpi="http://schemas.microsoft.com/office/word/2010/wordprocessingInk" xmlns:wne="http://schemas.microsoft.com/office/word/2006/wordml" xmlns:wps="http://schemas.microsoft.com/office/word/2010/wordprocessingShape" mc:Ignorable="w14 w15 w16se w16cid w16 w16cex w16sdtdh w16sdtfl w16du wp14">
+<w:numbering xmlns:wpc="http://schemas.microsoft.com/office/word/2010/wordprocessingCanvas" xmlns:cx="http://schemas.microsoft.com/office/drawing/2014/chartex" xmlns:cx1="http://schemas.microsoft.com/office/drawing/2015/9/8/chartex" xmlns:cx2="http://schemas.microsoft.com/office/drawing/2015/10/21/chartex" xmlns:cx3="http://schemas.microsoft.com/office/drawing/2016/5/9/chartex" xmlns:cx4="http://schemas.microsoft.com/office/drawing/2016/5/10/chartex" xmlns:cx5="http://schemas.microsoft.com/office/drawing/2016/5/11/chartex" xmlns:cx6="http://schemas.microsoft.com/office/drawing/2016/5/12/chartex" xmlns:cx7="http://schemas.microsoft.com/office/drawing/2016/5/13/chartex" xmlns:cx8="http://schemas.microsoft.com/office/drawing/2016/5/14/chartex" xmlns:mc="http://schemas.openxmlformats.org/markup-compatibility/2006" xmlns:aink="http://schemas.microsoft.com/office/drawing/2016/ink" xmlns:am3d="http://schemas.microsoft.com/office/drawing/2017/model3d" xmlns:o="urn:schemas-microsoft-com:office:office" xmlns:oel="http://schemas.microsoft.com/office/2019/extlst" xmlns:r="http://schemas.openxmlformats.org/officeDocument/2006/relationships" xmlns:m="http://schemas.openxmlformats.org/officeDocument/2006/math" xmlns:v="urn:schemas-microsoft-com:vml" xmlns:wp14="http://schemas.microsoft.com/office/word/2010/wordprocessingDrawing" xmlns:wp="http://schemas.openxmlformats.org/drawingml/2006/wordprocessingDrawing" xmlns:w10="urn:schemas-microsoft-com:office:word" xmlns:w="http://schemas.openxmlformats.org/wordprocessingml/2006/main" xmlns:w14="http://schemas.microsoft.com/office/word/2010/wordml" xmlns:w15="http://schemas.microsoft.com/office/word/2012/wordml" xmlns:w16cei="http://schemas.microsoft.com/office/word/2026/wordml/cei" xmlns:w16cex="http://schemas.microsoft.com/office/word/2018/wordml/cex" xmlns:w16cid="http://schemas.microsoft.com/office/word/2016/wordml/cid" xmlns:w16="http://schemas.microsoft.com/office/word/2018/wordml" xmlns:w16du="http://schemas.microsoft.com/office/word/2023/wordml/word16du" xmlns:w16sdtdh="http://schemas.microsoft.com/office/word/2020/wordml/sdtdatahash" xmlns:w16sdtfl="http://schemas.microsoft.com/office/word/2024/wordml/sdtformatlock" xmlns:w16se="http://schemas.microsoft.com/office/word/2015/wordml/symex" xmlns:wpg="http://schemas.microsoft.com/office/word/2010/wordprocessingGroup" xmlns:wpi="http://schemas.microsoft.com/office/word/2010/wordprocessingInk" xmlns:wne="http://schemas.microsoft.com/office/word/2006/wordml" xmlns:wps="http://schemas.microsoft.com/office/word/2010/wordprocessingShape" mc:Ignorable="w14 w15 w16se w16cid w16 w16cex w16sdtdh w16sdtfl w16du wp14">
   <w:abstractNum w:abstractNumId="0" w15:restartNumberingAfterBreak="0">
     <w:nsid w:val="402453C1"/>
     <w:multiLevelType w:val="multilevel"/>
-    <w:tmpl w:val="C226CEFA"/>
+    <w:tmpl w:val="32A431D6"/>
     <w:lvl w:ilvl="0">
       <w:start w:val="1"/>
       <w:numFmt w:val="bullet"/>
@@ -747,6 +2335,8 @@
       </w:pPr>
       <w:rPr>
         <w:rFonts w:ascii="Symbol" w:hAnsi="Symbol" w:hint="default"/>
+        <w:b w:val="0"/>
+        <w:bCs w:val="0"/>
         <w:sz w:val="20"/>
       </w:rPr>
     </w:lvl>
@@ -1035,6 +2625,14 @@
     <w:abstractNumId w:val="1"/>
   </w:num>
 </w:numbering>
+</file>
+
+<file path=word/people.xml><?xml version="1.0" encoding="utf-8"?>
+<w15:people xmlns:wpc="http://schemas.microsoft.com/office/word/2010/wordprocessingCanvas" xmlns:cx="http://schemas.microsoft.com/office/drawing/2014/chartex" xmlns:cx1="http://schemas.microsoft.com/office/drawing/2015/9/8/chartex" xmlns:cx2="http://schemas.microsoft.com/office/drawing/2015/10/21/chartex" xmlns:cx3="http://schemas.microsoft.com/office/drawing/2016/5/9/chartex" xmlns:cx4="http://schemas.microsoft.com/office/drawing/2016/5/10/chartex" xmlns:cx5="http://schemas.microsoft.com/office/drawing/2016/5/11/chartex" xmlns:cx6="http://schemas.microsoft.com/office/drawing/2016/5/12/chartex" xmlns:cx7="http://schemas.microsoft.com/office/drawing/2016/5/13/chartex" xmlns:cx8="http://schemas.microsoft.com/office/drawing/2016/5/14/chartex" xmlns:mc="http://schemas.openxmlformats.org/markup-compatibility/2006" xmlns:aink="http://schemas.microsoft.com/office/drawing/2016/ink" xmlns:am3d="http://schemas.microsoft.com/office/drawing/2017/model3d" xmlns:o="urn:schemas-microsoft-com:office:office" xmlns:oel="http://schemas.microsoft.com/office/2019/extlst" xmlns:r="http://schemas.openxmlformats.org/officeDocument/2006/relationships" xmlns:m="http://schemas.openxmlformats.org/officeDocument/2006/math" xmlns:v="urn:schemas-microsoft-com:vml" xmlns:wp14="http://schemas.microsoft.com/office/word/2010/wordprocessingDrawing" xmlns:wp="http://schemas.openxmlformats.org/drawingml/2006/wordprocessingDrawing" xmlns:w10="urn:schemas-microsoft-com:office:word" xmlns:w="http://schemas.openxmlformats.org/wordprocessingml/2006/main" xmlns:w14="http://schemas.microsoft.com/office/word/2010/wordml" xmlns:w15="http://schemas.microsoft.com/office/word/2012/wordml" xmlns:w16cei="http://schemas.microsoft.com/office/word/2026/wordml/cei" xmlns:w16cex="http://schemas.microsoft.com/office/word/2018/wordml/cex" xmlns:w16cid="http://schemas.microsoft.com/office/word/2016/wordml/cid" xmlns:w16="http://schemas.microsoft.com/office/word/2018/wordml" xmlns:w16du="http://schemas.microsoft.com/office/word/2023/wordml/word16du" xmlns:w16sdtdh="http://schemas.microsoft.com/office/word/2020/wordml/sdtdatahash" xmlns:w16sdtfl="http://schemas.microsoft.com/office/word/2024/wordml/sdtformatlock" xmlns:w16se="http://schemas.microsoft.com/office/word/2015/wordml/symex" xmlns:wpg="http://schemas.microsoft.com/office/word/2010/wordprocessingGroup" xmlns:wpi="http://schemas.microsoft.com/office/word/2010/wordprocessingInk" xmlns:wne="http://schemas.microsoft.com/office/word/2006/wordml" xmlns:wps="http://schemas.microsoft.com/office/word/2010/wordprocessingShape" mc:Ignorable="w14 w15 w16se w16cid w16 w16cex w16sdtdh w16sdtfl w16du wp14">
+  <w15:person w15:author="THIFFANY GONÇALVES">
+    <w15:presenceInfo w15:providerId="AD" w15:userId="S::7704479@formacao.iefp.pt::01cb5306-b790-475f-9065-7348ef4a47ad"/>
+  </w15:person>
+</w15:people>
 </file>
 
 <file path=word/styles.xml><?xml version="1.0" encoding="utf-8"?>
@@ -1644,7 +3242,6 @@
   <w:style w:type="character" w:default="1" w:styleId="Tipodeletrapredefinidodopargrafo">
     <w:name w:val="Default Paragraph Font"/>
     <w:uiPriority w:val="1"/>
-    <w:semiHidden/>
     <w:unhideWhenUsed/>
   </w:style>
   <w:style w:type="table" w:default="1" w:styleId="Tabelanormal">
@@ -2001,6 +3598,72 @@
     <w:link w:val="Rodap"/>
     <w:uiPriority w:val="99"/>
     <w:rsid w:val="002151F0"/>
+  </w:style>
+  <w:style w:type="character" w:styleId="Refdecomentrio">
+    <w:name w:val="annotation reference"/>
+    <w:basedOn w:val="Tipodeletrapredefinidodopargrafo"/>
+    <w:uiPriority w:val="99"/>
+    <w:semiHidden/>
+    <w:unhideWhenUsed/>
+    <w:rsid w:val="00E60AF2"/>
+    <w:rPr>
+      <w:sz w:val="16"/>
+      <w:szCs w:val="16"/>
+    </w:rPr>
+  </w:style>
+  <w:style w:type="paragraph" w:styleId="Textodecomentrio">
+    <w:name w:val="annotation text"/>
+    <w:basedOn w:val="Normal"/>
+    <w:link w:val="TextodecomentrioCarter"/>
+    <w:uiPriority w:val="99"/>
+    <w:unhideWhenUsed/>
+    <w:rsid w:val="00E60AF2"/>
+    <w:pPr>
+      <w:spacing w:line="240" w:lineRule="auto"/>
+    </w:pPr>
+    <w:rPr>
+      <w:sz w:val="20"/>
+      <w:szCs w:val="20"/>
+    </w:rPr>
+  </w:style>
+  <w:style w:type="character" w:customStyle="1" w:styleId="TextodecomentrioCarter">
+    <w:name w:val="Texto de comentário Caráter"/>
+    <w:basedOn w:val="Tipodeletrapredefinidodopargrafo"/>
+    <w:link w:val="Textodecomentrio"/>
+    <w:uiPriority w:val="99"/>
+    <w:rsid w:val="00E60AF2"/>
+    <w:rPr>
+      <w:sz w:val="20"/>
+      <w:szCs w:val="20"/>
+    </w:rPr>
+  </w:style>
+  <w:style w:type="paragraph" w:styleId="Assuntodecomentrio">
+    <w:name w:val="annotation subject"/>
+    <w:basedOn w:val="Textodecomentrio"/>
+    <w:next w:val="Textodecomentrio"/>
+    <w:link w:val="AssuntodecomentrioCarter"/>
+    <w:uiPriority w:val="99"/>
+    <w:semiHidden/>
+    <w:unhideWhenUsed/>
+    <w:rsid w:val="00E60AF2"/>
+    <w:rPr>
+      <w:b/>
+      <w:bCs/>
+    </w:rPr>
+  </w:style>
+  <w:style w:type="character" w:customStyle="1" w:styleId="AssuntodecomentrioCarter">
+    <w:name w:val="Assunto de comentário Caráter"/>
+    <w:basedOn w:val="TextodecomentrioCarter"/>
+    <w:link w:val="Assuntodecomentrio"/>
+    <w:uiPriority w:val="99"/>
+    <w:semiHidden/>
+    <w:rsid w:val="00E60AF2"/>
+    <w:rPr>
+      <w:b/>
+      <w:bCs/>
+      <w:sz w:val="20"/>
+      <w:szCs w:val="20"/>
+    </w:rPr>
   </w:style>
 </w:styles>
 </file>

</xml_diff>